<commit_message>
docs: formata o estudo de caso nas normas ABNT e redesenha o diagrama de casos de uso
- documento .docx segundo NBR 14724/6024/6027/6023: capa, folha de rosto com
  nota de natureza, resumo com palavras-chave, sumario, secoes primarias em
  caixa alta iniciando em nova pagina, recuo de 1,25 cm, entrelinhas 1,5,
  paginacao no canto superior direito a partir da introducao, quadros e
  figuras com legenda e fonte, e secao de referencias
- autoria: Gabriel Vinicius e Pedro Avila
- diagrama de casos de uso redesenhado na notacao classica de ferramenta UML
  (moldura com aba, elipses amarelas, estereotipos <<include>>/<<extend>>)

Co-Authored-By: Claude Opus 5 <noreply@anthropic.com>
Claude-Session: https://claude.ai/code/session_01UXbLdAyqso9ejY2gUxdP3k
</commit_message>
<xml_diff>
--- a/docs/entrega-expressa/Entrega-Expressa-Estudo-de-Caso.docx
+++ b/docs/entrega-expressa/Entrega-Expressa-Estudo-de-Caso.docx
@@ -5,33 +5,42 @@
     <w:p>
       <w:pPr>
         <w:spacing w:after="0" w:line="360"/>
-        <w:ind w:firstLine="0"/>
         <w:jc w:val="center"/>
       </w:pPr>
       <w:r>
         <w:rPr>
           <w:b/>
           <w:bCs/>
-          <w:i w:val="false"/>
-          <w:iCs w:val="false"/>
           <w:sz w:val="24"/>
           <w:szCs w:val="24"/>
         </w:rPr>
-        <w:t xml:space="preserve">UMC - UNIVERSIDADE DE MOGI DAS CRUZES</w:t>
+        <w:t xml:space="preserve">UNIVERSIDADE DE MOGI DAS CRUZES</w:t>
       </w:r>
     </w:p>
     <w:p>
       <w:pPr>
         <w:spacing w:after="0" w:line="360"/>
-        <w:ind w:firstLine="0"/>
-        <w:jc w:val="both"/>
+        <w:jc w:val="center"/>
       </w:pPr>
       <w:r>
         <w:rPr>
           <w:b w:val="false"/>
           <w:bCs w:val="false"/>
-          <w:i w:val="false"/>
-          <w:iCs w:val="false"/>
+          <w:sz w:val="24"/>
+          <w:szCs w:val="24"/>
+        </w:rPr>
+        <w:t xml:space="preserve">CURSO DE SISTEMAS DE INFORMAÇÃO</w:t>
+      </w:r>
+    </w:p>
+    <w:p>
+      <w:pPr>
+        <w:spacing w:after="0" w:line="360"/>
+        <w:jc w:val="center"/>
+      </w:pPr>
+      <w:r>
+        <w:rPr>
+          <w:b w:val="false"/>
+          <w:bCs w:val="false"/>
           <w:sz w:val="24"/>
           <w:szCs w:val="24"/>
         </w:rPr>
@@ -41,15 +50,12 @@
     <w:p>
       <w:pPr>
         <w:spacing w:after="0" w:line="360"/>
-        <w:ind w:firstLine="0"/>
-        <w:jc w:val="both"/>
+        <w:jc w:val="center"/>
       </w:pPr>
       <w:r>
         <w:rPr>
           <w:b w:val="false"/>
           <w:bCs w:val="false"/>
-          <w:i w:val="false"/>
-          <w:iCs w:val="false"/>
           <w:sz w:val="24"/>
           <w:szCs w:val="24"/>
         </w:rPr>
@@ -59,15 +65,12 @@
     <w:p>
       <w:pPr>
         <w:spacing w:after="0" w:line="360"/>
-        <w:ind w:firstLine="0"/>
-        <w:jc w:val="both"/>
+        <w:jc w:val="center"/>
       </w:pPr>
       <w:r>
         <w:rPr>
           <w:b w:val="false"/>
           <w:bCs w:val="false"/>
-          <w:i w:val="false"/>
-          <w:iCs w:val="false"/>
           <w:sz w:val="24"/>
           <w:szCs w:val="24"/>
         </w:rPr>
@@ -77,15 +80,12 @@
     <w:p>
       <w:pPr>
         <w:spacing w:after="0" w:line="360"/>
-        <w:ind w:firstLine="0"/>
-        <w:jc w:val="both"/>
+        <w:jc w:val="center"/>
       </w:pPr>
       <w:r>
         <w:rPr>
           <w:b w:val="false"/>
           <w:bCs w:val="false"/>
-          <w:i w:val="false"/>
-          <w:iCs w:val="false"/>
           <w:sz w:val="24"/>
           <w:szCs w:val="24"/>
         </w:rPr>
@@ -95,15 +95,12 @@
     <w:p>
       <w:pPr>
         <w:spacing w:after="0" w:line="360"/>
-        <w:ind w:firstLine="0"/>
-        <w:jc w:val="both"/>
+        <w:jc w:val="center"/>
       </w:pPr>
       <w:r>
         <w:rPr>
           <w:b w:val="false"/>
           <w:bCs w:val="false"/>
-          <w:i w:val="false"/>
-          <w:iCs w:val="false"/>
           <w:sz w:val="24"/>
           <w:szCs w:val="24"/>
         </w:rPr>
@@ -113,15 +110,42 @@
     <w:p>
       <w:pPr>
         <w:spacing w:after="0" w:line="360"/>
-        <w:ind w:firstLine="0"/>
-        <w:jc w:val="both"/>
+        <w:jc w:val="center"/>
       </w:pPr>
       <w:r>
         <w:rPr>
           <w:b w:val="false"/>
           <w:bCs w:val="false"/>
-          <w:i w:val="false"/>
-          <w:iCs w:val="false"/>
+          <w:sz w:val="24"/>
+          <w:szCs w:val="24"/>
+        </w:rPr>
+        <w:t xml:space="preserve">GABRIEL VINICIUS</w:t>
+      </w:r>
+    </w:p>
+    <w:p>
+      <w:pPr>
+        <w:spacing w:after="0" w:line="360"/>
+        <w:jc w:val="center"/>
+      </w:pPr>
+      <w:r>
+        <w:rPr>
+          <w:b w:val="false"/>
+          <w:bCs w:val="false"/>
+          <w:sz w:val="24"/>
+          <w:szCs w:val="24"/>
+        </w:rPr>
+        <w:t xml:space="preserve">PEDRO ÁVILA</w:t>
+      </w:r>
+    </w:p>
+    <w:p>
+      <w:pPr>
+        <w:spacing w:after="0" w:line="360"/>
+        <w:jc w:val="center"/>
+      </w:pPr>
+      <w:r>
+        <w:rPr>
+          <w:b w:val="false"/>
+          <w:bCs w:val="false"/>
           <w:sz w:val="24"/>
           <w:szCs w:val="24"/>
         </w:rPr>
@@ -131,51 +155,12 @@
     <w:p>
       <w:pPr>
         <w:spacing w:after="0" w:line="360"/>
-        <w:ind w:firstLine="0"/>
         <w:jc w:val="center"/>
       </w:pPr>
       <w:r>
         <w:rPr>
           <w:b w:val="false"/>
           <w:bCs w:val="false"/>
-          <w:i w:val="false"/>
-          <w:iCs w:val="false"/>
-          <w:sz w:val="24"/>
-          <w:szCs w:val="24"/>
-        </w:rPr>
-        <w:t xml:space="preserve">[Nome do aluno]</w:t>
-      </w:r>
-    </w:p>
-    <w:p>
-      <w:pPr>
-        <w:spacing w:after="0" w:line="360"/>
-        <w:ind w:firstLine="0"/>
-        <w:jc w:val="center"/>
-      </w:pPr>
-      <w:r>
-        <w:rPr>
-          <w:b w:val="false"/>
-          <w:bCs w:val="false"/>
-          <w:i w:val="false"/>
-          <w:iCs w:val="false"/>
-          <w:sz w:val="24"/>
-          <w:szCs w:val="24"/>
-        </w:rPr>
-        <w:t xml:space="preserve">[Nome do aluno]</w:t>
-      </w:r>
-    </w:p>
-    <w:p>
-      <w:pPr>
-        <w:spacing w:after="0" w:line="360"/>
-        <w:ind w:firstLine="0"/>
-        <w:jc w:val="both"/>
-      </w:pPr>
-      <w:r>
-        <w:rPr>
-          <w:b w:val="false"/>
-          <w:bCs w:val="false"/>
-          <w:i w:val="false"/>
-          <w:iCs w:val="false"/>
           <w:sz w:val="24"/>
           <w:szCs w:val="24"/>
         </w:rPr>
@@ -185,15 +170,12 @@
     <w:p>
       <w:pPr>
         <w:spacing w:after="0" w:line="360"/>
-        <w:ind w:firstLine="0"/>
-        <w:jc w:val="both"/>
+        <w:jc w:val="center"/>
       </w:pPr>
       <w:r>
         <w:rPr>
           <w:b w:val="false"/>
           <w:bCs w:val="false"/>
-          <w:i w:val="false"/>
-          <w:iCs w:val="false"/>
           <w:sz w:val="24"/>
           <w:szCs w:val="24"/>
         </w:rPr>
@@ -203,15 +185,12 @@
     <w:p>
       <w:pPr>
         <w:spacing w:after="0" w:line="360"/>
-        <w:ind w:firstLine="0"/>
-        <w:jc w:val="both"/>
+        <w:jc w:val="center"/>
       </w:pPr>
       <w:r>
         <w:rPr>
           <w:b w:val="false"/>
           <w:bCs w:val="false"/>
-          <w:i w:val="false"/>
-          <w:iCs w:val="false"/>
           <w:sz w:val="24"/>
           <w:szCs w:val="24"/>
         </w:rPr>
@@ -221,15 +200,12 @@
     <w:p>
       <w:pPr>
         <w:spacing w:after="0" w:line="360"/>
-        <w:ind w:firstLine="0"/>
-        <w:jc w:val="both"/>
+        <w:jc w:val="center"/>
       </w:pPr>
       <w:r>
         <w:rPr>
           <w:b w:val="false"/>
           <w:bCs w:val="false"/>
-          <w:i w:val="false"/>
-          <w:iCs w:val="false"/>
           <w:sz w:val="24"/>
           <w:szCs w:val="24"/>
         </w:rPr>
@@ -239,15 +215,12 @@
     <w:p>
       <w:pPr>
         <w:spacing w:after="0" w:line="360"/>
-        <w:ind w:firstLine="0"/>
-        <w:jc w:val="both"/>
+        <w:jc w:val="center"/>
       </w:pPr>
       <w:r>
         <w:rPr>
           <w:b w:val="false"/>
           <w:bCs w:val="false"/>
-          <w:i w:val="false"/>
-          <w:iCs w:val="false"/>
           <w:sz w:val="24"/>
           <w:szCs w:val="24"/>
         </w:rPr>
@@ -257,15 +230,42 @@
     <w:p>
       <w:pPr>
         <w:spacing w:after="0" w:line="360"/>
-        <w:ind w:firstLine="0"/>
-        <w:jc w:val="both"/>
+        <w:jc w:val="center"/>
+      </w:pPr>
+      <w:r>
+        <w:rPr>
+          <w:b/>
+          <w:bCs/>
+          <w:sz w:val="28"/>
+          <w:szCs w:val="28"/>
+        </w:rPr>
+        <w:t xml:space="preserve">ENTREGA EXPRESSA</w:t>
+      </w:r>
+    </w:p>
+    <w:p>
+      <w:pPr>
+        <w:spacing w:after="0" w:line="360"/>
+        <w:jc w:val="center"/>
       </w:pPr>
       <w:r>
         <w:rPr>
           <w:b w:val="false"/>
           <w:bCs w:val="false"/>
-          <w:i w:val="false"/>
-          <w:iCs w:val="false"/>
+          <w:sz w:val="24"/>
+          <w:szCs w:val="24"/>
+        </w:rPr>
+        <w:t xml:space="preserve">SISTEMA DE GESTÃO DE UMA DISTRIBUIDORA DE E-COMMERCE</w:t>
+      </w:r>
+    </w:p>
+    <w:p>
+      <w:pPr>
+        <w:spacing w:after="0" w:line="360"/>
+        <w:jc w:val="center"/>
+      </w:pPr>
+      <w:r>
+        <w:rPr>
+          <w:b w:val="false"/>
+          <w:bCs w:val="false"/>
           <w:sz w:val="24"/>
           <w:szCs w:val="24"/>
         </w:rPr>
@@ -275,51 +275,12 @@
     <w:p>
       <w:pPr>
         <w:spacing w:after="0" w:line="360"/>
-        <w:ind w:firstLine="0"/>
-        <w:jc w:val="center"/>
-      </w:pPr>
-      <w:r>
-        <w:rPr>
-          <w:b/>
-          <w:bCs/>
-          <w:i w:val="false"/>
-          <w:iCs w:val="false"/>
-          <w:sz w:val="32"/>
-          <w:szCs w:val="32"/>
-        </w:rPr>
-        <w:t xml:space="preserve">ENTREGA EXPRESSA</w:t>
-      </w:r>
-    </w:p>
-    <w:p>
-      <w:pPr>
-        <w:spacing w:after="120" w:line="360"/>
-        <w:ind w:firstLine="0"/>
         <w:jc w:val="center"/>
       </w:pPr>
       <w:r>
         <w:rPr>
           <w:b w:val="false"/>
           <w:bCs w:val="false"/>
-          <w:i w:val="false"/>
-          <w:iCs w:val="false"/>
-          <w:sz w:val="26"/>
-          <w:szCs w:val="26"/>
-        </w:rPr>
-        <w:t xml:space="preserve">Sistema de Gestão de uma Distribuidora de E-commerce</w:t>
-      </w:r>
-    </w:p>
-    <w:p>
-      <w:pPr>
-        <w:spacing w:after="0" w:line="360"/>
-        <w:ind w:firstLine="0"/>
-        <w:jc w:val="both"/>
-      </w:pPr>
-      <w:r>
-        <w:rPr>
-          <w:b w:val="false"/>
-          <w:bCs w:val="false"/>
-          <w:i w:val="false"/>
-          <w:iCs w:val="false"/>
           <w:sz w:val="24"/>
           <w:szCs w:val="24"/>
         </w:rPr>
@@ -329,15 +290,12 @@
     <w:p>
       <w:pPr>
         <w:spacing w:after="0" w:line="360"/>
-        <w:ind w:firstLine="0"/>
-        <w:jc w:val="both"/>
+        <w:jc w:val="center"/>
       </w:pPr>
       <w:r>
         <w:rPr>
           <w:b w:val="false"/>
           <w:bCs w:val="false"/>
-          <w:i w:val="false"/>
-          <w:iCs w:val="false"/>
           <w:sz w:val="24"/>
           <w:szCs w:val="24"/>
         </w:rPr>
@@ -347,15 +305,12 @@
     <w:p>
       <w:pPr>
         <w:spacing w:after="0" w:line="360"/>
-        <w:ind w:firstLine="0"/>
-        <w:jc w:val="both"/>
+        <w:jc w:val="center"/>
       </w:pPr>
       <w:r>
         <w:rPr>
           <w:b w:val="false"/>
           <w:bCs w:val="false"/>
-          <w:i w:val="false"/>
-          <w:iCs w:val="false"/>
           <w:sz w:val="24"/>
           <w:szCs w:val="24"/>
         </w:rPr>
@@ -365,15 +320,12 @@
     <w:p>
       <w:pPr>
         <w:spacing w:after="0" w:line="360"/>
-        <w:ind w:firstLine="0"/>
-        <w:jc w:val="both"/>
+        <w:jc w:val="center"/>
       </w:pPr>
       <w:r>
         <w:rPr>
           <w:b w:val="false"/>
           <w:bCs w:val="false"/>
-          <w:i w:val="false"/>
-          <w:iCs w:val="false"/>
           <w:sz w:val="24"/>
           <w:szCs w:val="24"/>
         </w:rPr>
@@ -383,15 +335,12 @@
     <w:p>
       <w:pPr>
         <w:spacing w:after="0" w:line="360"/>
-        <w:ind w:firstLine="0"/>
-        <w:jc w:val="both"/>
+        <w:jc w:val="center"/>
       </w:pPr>
       <w:r>
         <w:rPr>
           <w:b w:val="false"/>
           <w:bCs w:val="false"/>
-          <w:i w:val="false"/>
-          <w:iCs w:val="false"/>
           <w:sz w:val="24"/>
           <w:szCs w:val="24"/>
         </w:rPr>
@@ -401,15 +350,12 @@
     <w:p>
       <w:pPr>
         <w:spacing w:after="0" w:line="360"/>
-        <w:ind w:firstLine="0"/>
-        <w:jc w:val="both"/>
+        <w:jc w:val="center"/>
       </w:pPr>
       <w:r>
         <w:rPr>
           <w:b w:val="false"/>
           <w:bCs w:val="false"/>
-          <w:i w:val="false"/>
-          <w:iCs w:val="false"/>
           <w:sz w:val="24"/>
           <w:szCs w:val="24"/>
         </w:rPr>
@@ -419,15 +365,12 @@
     <w:p>
       <w:pPr>
         <w:spacing w:after="0" w:line="360"/>
-        <w:ind w:firstLine="0"/>
-        <w:jc w:val="both"/>
+        <w:jc w:val="center"/>
       </w:pPr>
       <w:r>
         <w:rPr>
           <w:b w:val="false"/>
           <w:bCs w:val="false"/>
-          <w:i w:val="false"/>
-          <w:iCs w:val="false"/>
           <w:sz w:val="24"/>
           <w:szCs w:val="24"/>
         </w:rPr>
@@ -437,15 +380,12 @@
     <w:p>
       <w:pPr>
         <w:spacing w:after="0" w:line="360"/>
-        <w:ind w:firstLine="0"/>
-        <w:jc w:val="both"/>
+        <w:jc w:val="center"/>
       </w:pPr>
       <w:r>
         <w:rPr>
           <w:b w:val="false"/>
           <w:bCs w:val="false"/>
-          <w:i w:val="false"/>
-          <w:iCs w:val="false"/>
           <w:sz w:val="24"/>
           <w:szCs w:val="24"/>
         </w:rPr>
@@ -455,15 +395,77 @@
     <w:p>
       <w:pPr>
         <w:spacing w:after="0" w:line="360"/>
-        <w:ind w:firstLine="0"/>
-        <w:jc w:val="both"/>
+        <w:jc w:val="center"/>
       </w:pPr>
       <w:r>
         <w:rPr>
           <w:b w:val="false"/>
           <w:bCs w:val="false"/>
-          <w:i w:val="false"/>
-          <w:iCs w:val="false"/>
+          <w:sz w:val="24"/>
+          <w:szCs w:val="24"/>
+        </w:rPr>
+        <w:t xml:space="preserve">MOGI DAS CRUZES - SP</w:t>
+      </w:r>
+    </w:p>
+    <w:p>
+      <w:pPr>
+        <w:spacing w:after="0" w:line="360"/>
+        <w:jc w:val="center"/>
+      </w:pPr>
+      <w:r>
+        <w:rPr>
+          <w:b w:val="false"/>
+          <w:bCs w:val="false"/>
+          <w:sz w:val="24"/>
+          <w:szCs w:val="24"/>
+        </w:rPr>
+        <w:t xml:space="preserve">2026</w:t>
+      </w:r>
+    </w:p>
+    <w:p>
+      <w:r>
+        <w:br w:type="page"/>
+      </w:r>
+    </w:p>
+    <w:p>
+      <w:pPr>
+        <w:spacing w:after="0" w:line="360"/>
+        <w:jc w:val="center"/>
+      </w:pPr>
+      <w:r>
+        <w:rPr>
+          <w:b w:val="false"/>
+          <w:bCs w:val="false"/>
+          <w:sz w:val="24"/>
+          <w:szCs w:val="24"/>
+        </w:rPr>
+        <w:t xml:space="preserve">GABRIEL VINICIUS</w:t>
+      </w:r>
+    </w:p>
+    <w:p>
+      <w:pPr>
+        <w:spacing w:after="0" w:line="360"/>
+        <w:jc w:val="center"/>
+      </w:pPr>
+      <w:r>
+        <w:rPr>
+          <w:b w:val="false"/>
+          <w:bCs w:val="false"/>
+          <w:sz w:val="24"/>
+          <w:szCs w:val="24"/>
+        </w:rPr>
+        <w:t xml:space="preserve">PEDRO ÁVILA</w:t>
+      </w:r>
+    </w:p>
+    <w:p>
+      <w:pPr>
+        <w:spacing w:after="0" w:line="360"/>
+        <w:jc w:val="center"/>
+      </w:pPr>
+      <w:r>
+        <w:rPr>
+          <w:b w:val="false"/>
+          <w:bCs w:val="false"/>
           <w:sz w:val="24"/>
           <w:szCs w:val="24"/>
         </w:rPr>
@@ -473,15 +475,281 @@
     <w:p>
       <w:pPr>
         <w:spacing w:after="0" w:line="360"/>
-        <w:ind w:firstLine="0"/>
         <w:jc w:val="center"/>
       </w:pPr>
       <w:r>
         <w:rPr>
           <w:b w:val="false"/>
           <w:bCs w:val="false"/>
-          <w:i w:val="false"/>
-          <w:iCs w:val="false"/>
+          <w:sz w:val="24"/>
+          <w:szCs w:val="24"/>
+        </w:rPr>
+        <w:t xml:space="preserve"/>
+      </w:r>
+    </w:p>
+    <w:p>
+      <w:pPr>
+        <w:spacing w:after="0" w:line="360"/>
+        <w:jc w:val="center"/>
+      </w:pPr>
+      <w:r>
+        <w:rPr>
+          <w:b w:val="false"/>
+          <w:bCs w:val="false"/>
+          <w:sz w:val="24"/>
+          <w:szCs w:val="24"/>
+        </w:rPr>
+        <w:t xml:space="preserve"/>
+      </w:r>
+    </w:p>
+    <w:p>
+      <w:pPr>
+        <w:spacing w:after="0" w:line="360"/>
+        <w:jc w:val="center"/>
+      </w:pPr>
+      <w:r>
+        <w:rPr>
+          <w:b w:val="false"/>
+          <w:bCs w:val="false"/>
+          <w:sz w:val="24"/>
+          <w:szCs w:val="24"/>
+        </w:rPr>
+        <w:t xml:space="preserve"/>
+      </w:r>
+    </w:p>
+    <w:p>
+      <w:pPr>
+        <w:spacing w:after="0" w:line="360"/>
+        <w:jc w:val="center"/>
+      </w:pPr>
+      <w:r>
+        <w:rPr>
+          <w:b w:val="false"/>
+          <w:bCs w:val="false"/>
+          <w:sz w:val="24"/>
+          <w:szCs w:val="24"/>
+        </w:rPr>
+        <w:t xml:space="preserve"/>
+      </w:r>
+    </w:p>
+    <w:p>
+      <w:pPr>
+        <w:spacing w:after="0" w:line="360"/>
+        <w:jc w:val="center"/>
+      </w:pPr>
+      <w:r>
+        <w:rPr>
+          <w:b w:val="false"/>
+          <w:bCs w:val="false"/>
+          <w:sz w:val="24"/>
+          <w:szCs w:val="24"/>
+        </w:rPr>
+        <w:t xml:space="preserve"/>
+      </w:r>
+    </w:p>
+    <w:p>
+      <w:pPr>
+        <w:spacing w:after="0" w:line="360"/>
+        <w:jc w:val="center"/>
+      </w:pPr>
+      <w:r>
+        <w:rPr>
+          <w:b/>
+          <w:bCs/>
+          <w:sz w:val="28"/>
+          <w:szCs w:val="28"/>
+        </w:rPr>
+        <w:t xml:space="preserve">ENTREGA EXPRESSA</w:t>
+      </w:r>
+    </w:p>
+    <w:p>
+      <w:pPr>
+        <w:spacing w:after="0" w:line="360"/>
+        <w:jc w:val="center"/>
+      </w:pPr>
+      <w:r>
+        <w:rPr>
+          <w:b w:val="false"/>
+          <w:bCs w:val="false"/>
+          <w:sz w:val="24"/>
+          <w:szCs w:val="24"/>
+        </w:rPr>
+        <w:t xml:space="preserve">SISTEMA DE GESTÃO DE UMA DISTRIBUIDORA DE E-COMMERCE</w:t>
+      </w:r>
+    </w:p>
+    <w:p>
+      <w:pPr>
+        <w:spacing w:after="0" w:line="360"/>
+        <w:jc w:val="center"/>
+      </w:pPr>
+      <w:r>
+        <w:rPr>
+          <w:b w:val="false"/>
+          <w:bCs w:val="false"/>
+          <w:sz w:val="24"/>
+          <w:szCs w:val="24"/>
+        </w:rPr>
+        <w:t xml:space="preserve"/>
+      </w:r>
+    </w:p>
+    <w:p>
+      <w:pPr>
+        <w:spacing w:after="0" w:line="360"/>
+        <w:jc w:val="center"/>
+      </w:pPr>
+      <w:r>
+        <w:rPr>
+          <w:b w:val="false"/>
+          <w:bCs w:val="false"/>
+          <w:sz w:val="24"/>
+          <w:szCs w:val="24"/>
+        </w:rPr>
+        <w:t xml:space="preserve"/>
+      </w:r>
+    </w:p>
+    <w:p>
+      <w:pPr>
+        <w:spacing w:after="0" w:line="360"/>
+        <w:jc w:val="center"/>
+      </w:pPr>
+      <w:r>
+        <w:rPr>
+          <w:b w:val="false"/>
+          <w:bCs w:val="false"/>
+          <w:sz w:val="24"/>
+          <w:szCs w:val="24"/>
+        </w:rPr>
+        <w:t xml:space="preserve"/>
+      </w:r>
+    </w:p>
+    <w:p>
+      <w:pPr>
+        <w:spacing w:after="0" w:line="360"/>
+        <w:jc w:val="center"/>
+      </w:pPr>
+      <w:r>
+        <w:rPr>
+          <w:b w:val="false"/>
+          <w:bCs w:val="false"/>
+          <w:sz w:val="24"/>
+          <w:szCs w:val="24"/>
+        </w:rPr>
+        <w:t xml:space="preserve"/>
+      </w:r>
+    </w:p>
+    <w:p>
+      <w:pPr>
+        <w:spacing w:after="0" w:line="240"/>
+        <w:ind w:left="4535"/>
+        <w:jc w:val="both"/>
+      </w:pPr>
+      <w:r>
+        <w:rPr>
+          <w:sz w:val="24"/>
+          <w:szCs w:val="24"/>
+        </w:rPr>
+        <w:t xml:space="preserve">Trabalho acadêmico apresentado à Universidade de Mogi das Cruzes como requisito parcial para avaliação da disciplina de Engenharia de Software, do curso de Sistemas de Informação, sob orientação de Prof.ª Vanessa e Prof.ª Elisabete.</w:t>
+      </w:r>
+    </w:p>
+    <w:p>
+      <w:pPr>
+        <w:spacing w:after="0" w:line="360"/>
+        <w:jc w:val="center"/>
+      </w:pPr>
+      <w:r>
+        <w:rPr>
+          <w:b w:val="false"/>
+          <w:bCs w:val="false"/>
+          <w:sz w:val="24"/>
+          <w:szCs w:val="24"/>
+        </w:rPr>
+        <w:t xml:space="preserve"/>
+      </w:r>
+    </w:p>
+    <w:p>
+      <w:pPr>
+        <w:spacing w:after="0" w:line="360"/>
+        <w:jc w:val="center"/>
+      </w:pPr>
+      <w:r>
+        <w:rPr>
+          <w:b w:val="false"/>
+          <w:bCs w:val="false"/>
+          <w:sz w:val="24"/>
+          <w:szCs w:val="24"/>
+        </w:rPr>
+        <w:t xml:space="preserve"/>
+      </w:r>
+    </w:p>
+    <w:p>
+      <w:pPr>
+        <w:spacing w:after="0" w:line="360"/>
+        <w:jc w:val="center"/>
+      </w:pPr>
+      <w:r>
+        <w:rPr>
+          <w:b w:val="false"/>
+          <w:bCs w:val="false"/>
+          <w:sz w:val="24"/>
+          <w:szCs w:val="24"/>
+        </w:rPr>
+        <w:t xml:space="preserve"/>
+      </w:r>
+    </w:p>
+    <w:p>
+      <w:pPr>
+        <w:spacing w:after="0" w:line="360"/>
+        <w:jc w:val="center"/>
+      </w:pPr>
+      <w:r>
+        <w:rPr>
+          <w:b w:val="false"/>
+          <w:bCs w:val="false"/>
+          <w:sz w:val="24"/>
+          <w:szCs w:val="24"/>
+        </w:rPr>
+        <w:t xml:space="preserve"/>
+      </w:r>
+    </w:p>
+    <w:p>
+      <w:pPr>
+        <w:spacing w:after="0" w:line="360"/>
+        <w:jc w:val="center"/>
+      </w:pPr>
+      <w:r>
+        <w:rPr>
+          <w:b w:val="false"/>
+          <w:bCs w:val="false"/>
+          <w:sz w:val="24"/>
+          <w:szCs w:val="24"/>
+        </w:rPr>
+        <w:t xml:space="preserve"/>
+      </w:r>
+    </w:p>
+    <w:p>
+      <w:pPr>
+        <w:spacing w:after="0" w:line="360"/>
+        <w:jc w:val="center"/>
+      </w:pPr>
+      <w:r>
+        <w:rPr>
+          <w:b w:val="false"/>
+          <w:bCs w:val="false"/>
+          <w:sz w:val="24"/>
+          <w:szCs w:val="24"/>
+        </w:rPr>
+        <w:t xml:space="preserve"/>
+      </w:r>
+    </w:p>
+    <w:p>
+      <w:pPr>
+        <w:spacing w:after="0" w:line="360"/>
+        <w:jc w:val="center"/>
+      </w:pPr>
+      <w:r>
+        <w:rPr>
+          <w:b w:val="false"/>
+          <w:bCs w:val="false"/>
           <w:sz w:val="24"/>
           <w:szCs w:val="24"/>
         </w:rPr>
@@ -490,16 +758,13 @@
     </w:p>
     <w:p>
       <w:pPr>
-        <w:spacing w:after="120" w:line="360"/>
-        <w:ind w:firstLine="0"/>
+        <w:spacing w:after="0" w:line="360"/>
         <w:jc w:val="center"/>
       </w:pPr>
       <w:r>
         <w:rPr>
           <w:b w:val="false"/>
           <w:bCs w:val="false"/>
-          <w:i w:val="false"/>
-          <w:iCs w:val="false"/>
           <w:sz w:val="24"/>
           <w:szCs w:val="24"/>
         </w:rPr>
@@ -513,489 +778,74 @@
     </w:p>
     <w:p>
       <w:pPr>
-        <w:spacing w:after="0" w:line="360"/>
-        <w:ind w:firstLine="0"/>
+        <w:spacing w:after="360" w:line="360"/>
         <w:jc w:val="center"/>
       </w:pPr>
       <w:r>
         <w:rPr>
           <w:b/>
           <w:bCs/>
-          <w:i w:val="false"/>
-          <w:iCs w:val="false"/>
+          <w:caps/>
           <w:sz w:val="24"/>
           <w:szCs w:val="24"/>
         </w:rPr>
-        <w:t xml:space="preserve">UMC - UNIVERSIDADE DE MOGI DAS CRUZES</w:t>
-      </w:r>
-    </w:p>
-    <w:p>
-      <w:pPr>
-        <w:spacing w:after="0" w:line="360"/>
-        <w:ind w:firstLine="0"/>
+        <w:t xml:space="preserve">Resumo</w:t>
+      </w:r>
+    </w:p>
+    <w:p>
+      <w:pPr>
+        <w:spacing w:after="240" w:line="240"/>
         <w:jc w:val="both"/>
       </w:pPr>
       <w:r>
         <w:rPr>
-          <w:b w:val="false"/>
-          <w:bCs w:val="false"/>
-          <w:i w:val="false"/>
-          <w:iCs w:val="false"/>
           <w:sz w:val="24"/>
           <w:szCs w:val="24"/>
         </w:rPr>
-        <w:t xml:space="preserve"/>
-      </w:r>
-    </w:p>
-    <w:p>
-      <w:pPr>
-        <w:spacing w:after="0" w:line="360"/>
-        <w:ind w:firstLine="0"/>
+        <w:t xml:space="preserve">Este trabalho apresenta a análise e a modelagem de um sistema de informação para a gestão do centro de distribuição da empresa Entrega Expressa, distribuidora responsável pelo armazenamento e pela distribuição de produtos vendidos em plataformas de comércio eletrônico. O estudo parte da descrição do negócio, na qual grande parte dos processos é executada manualmente, situação que gera atrasos, erros na separação dos pedidos e dificuldades no controle de estoque. Como método, foi realizado o levantamento de requisitos funcionais e não funcionais, seguido da modelagem em Linguagem de Modelagem Unificada (UML), com a elaboração do diagrama de casos de uso, empregando os relacionamentos de inclusão e extensão, e de oito diagramas de atividades correspondentes aos processos essenciais da operação. Como resultado, obteve-se um conjunto de doze regras de negócio, vinte e cinco requisitos funcionais, quinze requisitos não funcionais, onze atores e vinte e nove casos de uso, articulados por uma matriz de rastreabilidade que relaciona cada requisito aos casos de uso e aos diagramas que o detalham. Conclui-se que a modelagem cobre integralmente o ciclo do pedido, do recebimento automático à confirmação da entrega, e trata de forma explícita as duas situações críticas relatadas pela empresa: a indisponibilidade de estoque e a ausência de rastreabilidade das movimentações.</w:t>
+      </w:r>
+    </w:p>
+    <w:p>
+      <w:pPr>
+        <w:spacing w:after="0" w:line="240"/>
         <w:jc w:val="both"/>
       </w:pPr>
       <w:r>
         <w:rPr>
-          <w:b w:val="false"/>
-          <w:bCs w:val="false"/>
-          <w:i w:val="false"/>
-          <w:iCs w:val="false"/>
+          <w:b/>
+          <w:bCs/>
           <w:sz w:val="24"/>
           <w:szCs w:val="24"/>
         </w:rPr>
-        <w:t xml:space="preserve"/>
-      </w:r>
-    </w:p>
-    <w:p>
-      <w:pPr>
-        <w:spacing w:after="0" w:line="360"/>
-        <w:ind w:firstLine="0"/>
-        <w:jc w:val="both"/>
-      </w:pPr>
+        <w:t xml:space="preserve">Palavras-chave: </w:t>
+      </w:r>
       <w:r>
         <w:rPr>
-          <w:b w:val="false"/>
-          <w:bCs w:val="false"/>
-          <w:i w:val="false"/>
-          <w:iCs w:val="false"/>
           <w:sz w:val="24"/>
           <w:szCs w:val="24"/>
         </w:rPr>
-        <w:t xml:space="preserve"/>
-      </w:r>
-    </w:p>
-    <w:p>
-      <w:pPr>
-        <w:spacing w:after="0" w:line="360"/>
-        <w:ind w:firstLine="0"/>
-        <w:jc w:val="both"/>
+        <w:t xml:space="preserve">engenharia de software; UML; levantamento de requisitos; centro de distribuição; comércio eletrônico.</w:t>
+      </w:r>
+    </w:p>
+    <w:p>
+      <w:r>
+        <w:br w:type="page"/>
+      </w:r>
+    </w:p>
+    <w:p>
+      <w:pPr>
+        <w:spacing w:after="360" w:line="360"/>
+        <w:jc w:val="center"/>
       </w:pPr>
       <w:r>
         <w:rPr>
-          <w:b w:val="false"/>
-          <w:bCs w:val="false"/>
-          <w:i w:val="false"/>
-          <w:iCs w:val="false"/>
+          <w:b/>
+          <w:bCs/>
+          <w:caps/>
           <w:sz w:val="24"/>
           <w:szCs w:val="24"/>
         </w:rPr>
-        <w:t xml:space="preserve"/>
-      </w:r>
-    </w:p>
-    <w:p>
-      <w:pPr>
-        <w:spacing w:after="0" w:line="360"/>
-        <w:ind w:firstLine="0"/>
-        <w:jc w:val="both"/>
-      </w:pPr>
-      <w:r>
-        <w:rPr>
-          <w:b w:val="false"/>
-          <w:bCs w:val="false"/>
-          <w:i w:val="false"/>
-          <w:iCs w:val="false"/>
-          <w:sz w:val="24"/>
-          <w:szCs w:val="24"/>
-        </w:rPr>
-        <w:t xml:space="preserve"/>
-      </w:r>
-    </w:p>
-    <w:p>
-      <w:pPr>
-        <w:spacing w:after="0" w:line="360"/>
-        <w:ind w:firstLine="0"/>
-        <w:jc w:val="center"/>
-      </w:pPr>
-      <w:r>
-        <w:rPr>
-          <w:b w:val="false"/>
-          <w:bCs w:val="false"/>
-          <w:i w:val="false"/>
-          <w:iCs w:val="false"/>
-          <w:sz w:val="24"/>
-          <w:szCs w:val="24"/>
-        </w:rPr>
-        <w:t xml:space="preserve">[Nome do aluno]</w:t>
-      </w:r>
-    </w:p>
-    <w:p>
-      <w:pPr>
-        <w:spacing w:after="0" w:line="360"/>
-        <w:ind w:firstLine="0"/>
-        <w:jc w:val="center"/>
-      </w:pPr>
-      <w:r>
-        <w:rPr>
-          <w:b w:val="false"/>
-          <w:bCs w:val="false"/>
-          <w:i w:val="false"/>
-          <w:iCs w:val="false"/>
-          <w:sz w:val="24"/>
-          <w:szCs w:val="24"/>
-        </w:rPr>
-        <w:t xml:space="preserve">[Nome do aluno]</w:t>
-      </w:r>
-    </w:p>
-    <w:p>
-      <w:pPr>
-        <w:spacing w:after="0" w:line="360"/>
-        <w:ind w:firstLine="0"/>
-        <w:jc w:val="both"/>
-      </w:pPr>
-      <w:r>
-        <w:rPr>
-          <w:b w:val="false"/>
-          <w:bCs w:val="false"/>
-          <w:i w:val="false"/>
-          <w:iCs w:val="false"/>
-          <w:sz w:val="24"/>
-          <w:szCs w:val="24"/>
-        </w:rPr>
-        <w:t xml:space="preserve"/>
-      </w:r>
-    </w:p>
-    <w:p>
-      <w:pPr>
-        <w:spacing w:after="0" w:line="360"/>
-        <w:ind w:firstLine="0"/>
-        <w:jc w:val="both"/>
-      </w:pPr>
-      <w:r>
-        <w:rPr>
-          <w:b w:val="false"/>
-          <w:bCs w:val="false"/>
-          <w:i w:val="false"/>
-          <w:iCs w:val="false"/>
-          <w:sz w:val="24"/>
-          <w:szCs w:val="24"/>
-        </w:rPr>
-        <w:t xml:space="preserve"/>
-      </w:r>
-    </w:p>
-    <w:p>
-      <w:pPr>
-        <w:spacing w:after="0" w:line="360"/>
-        <w:ind w:firstLine="0"/>
-        <w:jc w:val="both"/>
-      </w:pPr>
-      <w:r>
-        <w:rPr>
-          <w:b w:val="false"/>
-          <w:bCs w:val="false"/>
-          <w:i w:val="false"/>
-          <w:iCs w:val="false"/>
-          <w:sz w:val="24"/>
-          <w:szCs w:val="24"/>
-        </w:rPr>
-        <w:t xml:space="preserve"/>
-      </w:r>
-    </w:p>
-    <w:p>
-      <w:pPr>
-        <w:spacing w:after="0" w:line="360"/>
-        <w:ind w:firstLine="0"/>
-        <w:jc w:val="both"/>
-      </w:pPr>
-      <w:r>
-        <w:rPr>
-          <w:b w:val="false"/>
-          <w:bCs w:val="false"/>
-          <w:i w:val="false"/>
-          <w:iCs w:val="false"/>
-          <w:sz w:val="24"/>
-          <w:szCs w:val="24"/>
-        </w:rPr>
-        <w:t xml:space="preserve"/>
-      </w:r>
-    </w:p>
-    <w:p>
-      <w:pPr>
-        <w:spacing w:after="0" w:line="360"/>
-        <w:ind w:firstLine="0"/>
-        <w:jc w:val="center"/>
-      </w:pPr>
-      <w:r>
-        <w:rPr>
-          <w:b/>
-          <w:bCs/>
-          <w:i w:val="false"/>
-          <w:iCs w:val="false"/>
-          <w:sz w:val="32"/>
-          <w:szCs w:val="32"/>
-        </w:rPr>
-        <w:t xml:space="preserve">ENTREGA EXPRESSA</w:t>
-      </w:r>
-    </w:p>
-    <w:p>
-      <w:pPr>
-        <w:spacing w:after="120" w:line="360"/>
-        <w:ind w:firstLine="0"/>
-        <w:jc w:val="center"/>
-      </w:pPr>
-      <w:r>
-        <w:rPr>
-          <w:b w:val="false"/>
-          <w:bCs w:val="false"/>
-          <w:i w:val="false"/>
-          <w:iCs w:val="false"/>
-          <w:sz w:val="26"/>
-          <w:szCs w:val="26"/>
-        </w:rPr>
-        <w:t xml:space="preserve">Sistema de Gestão de uma Distribuidora de E-commerce</w:t>
-      </w:r>
-    </w:p>
-    <w:p>
-      <w:pPr>
-        <w:spacing w:after="0" w:line="360"/>
-        <w:ind w:firstLine="0"/>
-        <w:jc w:val="both"/>
-      </w:pPr>
-      <w:r>
-        <w:rPr>
-          <w:b w:val="false"/>
-          <w:bCs w:val="false"/>
-          <w:i w:val="false"/>
-          <w:iCs w:val="false"/>
-          <w:sz w:val="24"/>
-          <w:szCs w:val="24"/>
-        </w:rPr>
-        <w:t xml:space="preserve"/>
-      </w:r>
-    </w:p>
-    <w:p>
-      <w:pPr>
-        <w:spacing w:after="0" w:line="360"/>
-        <w:ind w:firstLine="0"/>
-        <w:jc w:val="both"/>
-      </w:pPr>
-      <w:r>
-        <w:rPr>
-          <w:b w:val="false"/>
-          <w:bCs w:val="false"/>
-          <w:i w:val="false"/>
-          <w:iCs w:val="false"/>
-          <w:sz w:val="24"/>
-          <w:szCs w:val="24"/>
-        </w:rPr>
-        <w:t xml:space="preserve"/>
-      </w:r>
-    </w:p>
-    <w:p>
-      <w:pPr>
-        <w:spacing w:after="0" w:line="360"/>
-        <w:ind w:firstLine="0"/>
-        <w:jc w:val="both"/>
-      </w:pPr>
-      <w:r>
-        <w:rPr>
-          <w:b w:val="false"/>
-          <w:bCs w:val="false"/>
-          <w:i w:val="false"/>
-          <w:iCs w:val="false"/>
-          <w:sz w:val="24"/>
-          <w:szCs w:val="24"/>
-        </w:rPr>
-        <w:t xml:space="preserve"/>
-      </w:r>
-    </w:p>
-    <w:p>
-      <w:pPr>
-        <w:spacing w:after="120" w:line="240"/>
-        <w:ind w:left="4535"/>
-        <w:jc w:val="both"/>
-      </w:pPr>
-      <w:r>
-        <w:rPr>
-          <w:sz w:val="22"/>
-          <w:szCs w:val="22"/>
-        </w:rPr>
-        <w:t xml:space="preserve">Trabalho apresentado à Universidade de Mogi das Cruzes como requisito para avaliação da disciplina de [Disciplina], do curso de Sistemas de Informação, sob orientação do(a) Prof.(a) [Nome do(a) professor(a)].</w:t>
-      </w:r>
-    </w:p>
-    <w:p>
-      <w:pPr>
-        <w:spacing w:after="0" w:line="360"/>
-        <w:ind w:firstLine="0"/>
-        <w:jc w:val="both"/>
-      </w:pPr>
-      <w:r>
-        <w:rPr>
-          <w:b w:val="false"/>
-          <w:bCs w:val="false"/>
-          <w:i w:val="false"/>
-          <w:iCs w:val="false"/>
-          <w:sz w:val="24"/>
-          <w:szCs w:val="24"/>
-        </w:rPr>
-        <w:t xml:space="preserve"/>
-      </w:r>
-    </w:p>
-    <w:p>
-      <w:pPr>
-        <w:spacing w:after="0" w:line="360"/>
-        <w:ind w:firstLine="0"/>
-        <w:jc w:val="both"/>
-      </w:pPr>
-      <w:r>
-        <w:rPr>
-          <w:b w:val="false"/>
-          <w:bCs w:val="false"/>
-          <w:i w:val="false"/>
-          <w:iCs w:val="false"/>
-          <w:sz w:val="24"/>
-          <w:szCs w:val="24"/>
-        </w:rPr>
-        <w:t xml:space="preserve"/>
-      </w:r>
-    </w:p>
-    <w:p>
-      <w:pPr>
-        <w:spacing w:after="0" w:line="360"/>
-        <w:ind w:firstLine="0"/>
-        <w:jc w:val="both"/>
-      </w:pPr>
-      <w:r>
-        <w:rPr>
-          <w:b w:val="false"/>
-          <w:bCs w:val="false"/>
-          <w:i w:val="false"/>
-          <w:iCs w:val="false"/>
-          <w:sz w:val="24"/>
-          <w:szCs w:val="24"/>
-        </w:rPr>
-        <w:t xml:space="preserve"/>
-      </w:r>
-    </w:p>
-    <w:p>
-      <w:pPr>
-        <w:spacing w:after="0" w:line="360"/>
-        <w:ind w:firstLine="0"/>
-        <w:jc w:val="both"/>
-      </w:pPr>
-      <w:r>
-        <w:rPr>
-          <w:b w:val="false"/>
-          <w:bCs w:val="false"/>
-          <w:i w:val="false"/>
-          <w:iCs w:val="false"/>
-          <w:sz w:val="24"/>
-          <w:szCs w:val="24"/>
-        </w:rPr>
-        <w:t xml:space="preserve"/>
-      </w:r>
-    </w:p>
-    <w:p>
-      <w:pPr>
-        <w:spacing w:after="0" w:line="360"/>
-        <w:ind w:firstLine="0"/>
-        <w:jc w:val="both"/>
-      </w:pPr>
-      <w:r>
-        <w:rPr>
-          <w:b w:val="false"/>
-          <w:bCs w:val="false"/>
-          <w:i w:val="false"/>
-          <w:iCs w:val="false"/>
-          <w:sz w:val="24"/>
-          <w:szCs w:val="24"/>
-        </w:rPr>
-        <w:t xml:space="preserve"/>
-      </w:r>
-    </w:p>
-    <w:p>
-      <w:pPr>
-        <w:spacing w:after="0" w:line="360"/>
-        <w:ind w:firstLine="0"/>
-        <w:jc w:val="both"/>
-      </w:pPr>
-      <w:r>
-        <w:rPr>
-          <w:b w:val="false"/>
-          <w:bCs w:val="false"/>
-          <w:i w:val="false"/>
-          <w:iCs w:val="false"/>
-          <w:sz w:val="24"/>
-          <w:szCs w:val="24"/>
-        </w:rPr>
-        <w:t xml:space="preserve"/>
-      </w:r>
-    </w:p>
-    <w:p>
-      <w:pPr>
-        <w:spacing w:after="0" w:line="360"/>
-        <w:ind w:firstLine="0"/>
-        <w:jc w:val="center"/>
-      </w:pPr>
-      <w:r>
-        <w:rPr>
-          <w:b w:val="false"/>
-          <w:bCs w:val="false"/>
-          <w:i w:val="false"/>
-          <w:iCs w:val="false"/>
-          <w:sz w:val="24"/>
-          <w:szCs w:val="24"/>
-        </w:rPr>
-        <w:t xml:space="preserve">MOGI DAS CRUZES - SP</w:t>
-      </w:r>
-    </w:p>
-    <w:p>
-      <w:pPr>
-        <w:spacing w:after="120" w:line="360"/>
-        <w:ind w:firstLine="0"/>
-        <w:jc w:val="center"/>
-      </w:pPr>
-      <w:r>
-        <w:rPr>
-          <w:b w:val="false"/>
-          <w:bCs w:val="false"/>
-          <w:i w:val="false"/>
-          <w:iCs w:val="false"/>
-          <w:sz w:val="24"/>
-          <w:szCs w:val="24"/>
-        </w:rPr>
-        <w:t xml:space="preserve">2026</w:t>
-      </w:r>
-    </w:p>
-    <w:p>
-      <w:r>
-        <w:br w:type="page"/>
-      </w:r>
-    </w:p>
-    <w:p>
-      <w:pPr>
-        <w:spacing w:after="120" w:line="360"/>
-        <w:ind w:firstLine="0"/>
-        <w:jc w:val="center"/>
-      </w:pPr>
-      <w:r>
-        <w:rPr>
-          <w:b/>
-          <w:bCs/>
-          <w:i w:val="false"/>
-          <w:iCs w:val="false"/>
-          <w:sz w:val="26"/>
-          <w:szCs w:val="26"/>
-        </w:rPr>
-        <w:t xml:space="preserve">SUMÁRIO</w:t>
+        <w:t xml:space="preserve">Sumário</w:t>
       </w:r>
     </w:p>
     <w:sdt>
@@ -1030,21 +880,23 @@
     <w:p>
       <w:pPr>
         <w:pStyle w:val="Heading1"/>
-        <w:spacing w:after="240" w:before="360" w:line="360"/>
+        <w:spacing w:after="360" w:before="0" w:line="360"/>
+        <w:jc w:val="left"/>
       </w:pPr>
       <w:r>
         <w:rPr>
           <w:b/>
           <w:bCs/>
-          <w:sz w:val="26"/>
-          <w:szCs w:val="26"/>
+          <w:caps/>
+          <w:sz w:val="24"/>
+          <w:szCs w:val="24"/>
         </w:rPr>
-        <w:t xml:space="preserve">1. INTRODUÇÃO</w:t>
-      </w:r>
-    </w:p>
-    <w:p>
-      <w:pPr>
-        <w:spacing w:after="120" w:line="360"/>
+        <w:t xml:space="preserve">1 INTRODUÇÃO</w:t>
+      </w:r>
+    </w:p>
+    <w:p>
+      <w:pPr>
+        <w:spacing w:after="0" w:before="0" w:line="360"/>
         <w:ind w:firstLine="708"/>
         <w:jc w:val="both"/>
       </w:pPr>
@@ -1057,12 +909,12 @@
           <w:sz w:val="24"/>
           <w:szCs w:val="24"/>
         </w:rPr>
-        <w:t xml:space="preserve">A Entrega Expressa é uma distribuidora responsável pelo armazenamento e pela distribuição de produtos vendidos em plataformas de comércio eletrônico como Mercado Livre, Shopee e lojas virtuais parceiras. Atualmente boa parte da operação é conduzida manualmente: os pedidos chegam por planilhas e e-mails, a conferência de estoque depende da experiência dos funcionários e o acompanhamento do pedido é feito por telefone. O resultado são atrasos, erros na separação, rupturas de estoque percebidas tarde demais e retrabalho na expedição.</w:t>
-      </w:r>
-    </w:p>
-    <w:p>
-      <w:pPr>
-        <w:spacing w:after="120" w:line="360"/>
+        <w:t xml:space="preserve">A Entrega Expressa é uma distribuidora responsável pelo armazenamento e pela distribuição de produtos vendidos em plataformas de comércio eletrônico, como Mercado Livre, Shopee e lojas virtuais parceiras. Atualmente, grande parte da operação é conduzida manualmente: os pedidos chegam por planilhas e mensagens de correio eletrônico, a conferência do estoque depende da experiência dos funcionários e o acompanhamento do pedido é feito por telefone. Esse cenário produz atrasos nas entregas, erros na separação dos produtos e dificuldades no controle de estoque.</w:t>
+      </w:r>
+    </w:p>
+    <w:p>
+      <w:pPr>
+        <w:spacing w:after="0" w:before="0" w:line="360"/>
         <w:ind w:firstLine="708"/>
         <w:jc w:val="both"/>
       </w:pPr>
@@ -1075,12 +927,12 @@
           <w:sz w:val="24"/>
           <w:szCs w:val="24"/>
         </w:rPr>
-        <w:t xml:space="preserve">O presente trabalho apresenta a análise e a modelagem de um sistema integrado para gerenciar todas as operações do centro de distribuição, cobrindo o ciclo completo do pedido: recebimento automático a partir das plataformas de venda, verificação e reserva de estoque, separação, embalagem, expedição, transporte e confirmação da entrega, mantendo o histórico de todas as movimentações realizadas.</w:t>
-      </w:r>
-    </w:p>
-    <w:p>
-      <w:pPr>
-        <w:spacing w:after="120" w:line="360"/>
+        <w:t xml:space="preserve">A engenharia de requisitos é a etapa do processo de desenvolvimento em que se estabelecem os serviços que o cliente requer de um sistema e as restrições sob as quais ele deve operar (SOMMERVILLE, 2019). A partir desse levantamento, a modelagem em Linguagem de Modelagem Unificada (UML) permite representar graficamente o comportamento esperado do software antes de sua construção, reduzindo ambiguidades entre os envolvidos (GUEDES, 2018).</w:t>
+      </w:r>
+    </w:p>
+    <w:p>
+      <w:pPr>
+        <w:spacing w:after="0" w:before="0" w:line="360"/>
         <w:ind w:firstLine="708"/>
         <w:jc w:val="both"/>
       </w:pPr>
@@ -1093,12 +945,12 @@
           <w:sz w:val="24"/>
           <w:szCs w:val="24"/>
         </w:rPr>
-        <w:t xml:space="preserve">O documento está organizado da seguinte forma: as regras de negócio que orientam a solução; o levantamento dos requisitos funcionais e não funcionais; o diagrama de casos de uso em UML, com a identificação dos atores e o uso dos relacionamentos «include» e «extend»; e os diagramas de atividades dos oito processos essenciais do sistema. Encerra-se com a matriz de rastreabilidade entre requisitos, casos de uso e diagramas.</w:t>
-      </w:r>
-    </w:p>
-    <w:p>
-      <w:pPr>
-        <w:spacing w:after="120" w:line="360"/>
+        <w:t xml:space="preserve">O presente trabalho apresenta a análise e a modelagem de um sistema integrado para gerenciar as operações do centro de distribuição, cobrindo o ciclo completo do pedido: recebimento automático a partir das plataformas de venda, verificação e reserva de estoque, separação, embalagem, expedição, transporte e confirmação da entrega, mantendo o histórico de todas as movimentações realizadas.</w:t>
+      </w:r>
+    </w:p>
+    <w:p>
+      <w:pPr>
+        <w:spacing w:after="0" w:before="0" w:line="360"/>
         <w:ind w:firstLine="708"/>
         <w:jc w:val="both"/>
       </w:pPr>
@@ -1111,28 +963,13 @@
           <w:sz w:val="24"/>
           <w:szCs w:val="24"/>
         </w:rPr>
-        <w:t xml:space="preserve">Os objetivos do sistema são eliminar o registro manual de pedidos, garantir um controle de saldo confiável com reserva de itens, padronizar a separação e a expedição, dar visibilidade do status do pedido ao cliente e à gerência e manter um histórico auditável das movimentações. Permanecem fora do escopo a emissão de nota fiscal, o faturamento e a gestão financeira, que continuam no ERP atual.</w:t>
-      </w:r>
-    </w:p>
-    <w:p>
-      <w:pPr>
-        <w:pStyle w:val="Heading1"/>
-        <w:spacing w:after="240" w:before="360" w:line="360"/>
-      </w:pPr>
-      <w:r>
-        <w:rPr>
-          <w:b/>
-          <w:bCs/>
-          <w:sz w:val="26"/>
-          <w:szCs w:val="26"/>
-        </w:rPr>
-        <w:t xml:space="preserve">2. REGRAS DE NEGÓCIO</w:t>
-      </w:r>
-    </w:p>
-    <w:p>
-      <w:pPr>
-        <w:spacing w:after="120" w:line="360"/>
-        <w:ind w:firstLine="0"/>
+        <w:t xml:space="preserve">O documento está organizado da seguinte forma: a seção 2 apresenta as regras de negócio que orientam a solução; as seções 3 e 4 apresentam, respectivamente, os requisitos funcionais e não funcionais; a seção 5 identifica os atores; a seção 6 apresenta o diagrama de casos de uso, com o emprego dos relacionamentos «include» e «extend»; a seção 7 apresenta os oito diagramas de atividades; e a seção 8 apresenta a matriz de rastreabilidade entre requisitos, casos de uso e diagramas. A seção 9 traz as considerações finais.</w:t>
+      </w:r>
+    </w:p>
+    <w:p>
+      <w:pPr>
+        <w:spacing w:after="0" w:before="0" w:line="360"/>
+        <w:ind w:firstLine="708"/>
         <w:jc w:val="both"/>
       </w:pPr>
       <w:r>
@@ -1144,19 +981,72 @@
           <w:sz w:val="24"/>
           <w:szCs w:val="24"/>
         </w:rPr>
-        <w:t xml:space="preserve">As regras a seguir orientam o comportamento esperado do sistema e são referenciadas pelos requisitos e pelos diagramas apresentados nas seções seguintes.</w:t>
+        <w:t xml:space="preserve">Os objetivos do sistema são eliminar o registro manual de pedidos, garantir controle de saldo confiável com reserva de itens, padronizar a separação e a expedição, dar visibilidade do status do pedido ao cliente e à gerência e manter histórico auditável das movimentações. Permanecem fora do escopo a emissão de nota fiscal, o faturamento e a gestão financeira, que continuam sob responsabilidade do sistema de gestão empresarial já utilizado.</w:t>
+      </w:r>
+    </w:p>
+    <w:p>
+      <w:r>
+        <w:br w:type="page"/>
+      </w:r>
+    </w:p>
+    <w:p>
+      <w:pPr>
+        <w:pStyle w:val="Heading1"/>
+        <w:spacing w:after="360" w:before="0" w:line="360"/>
+        <w:jc w:val="left"/>
+      </w:pPr>
+      <w:r>
+        <w:rPr>
+          <w:b/>
+          <w:bCs/>
+          <w:caps/>
+          <w:sz w:val="24"/>
+          <w:szCs w:val="24"/>
+        </w:rPr>
+        <w:t xml:space="preserve">2 REGRAS DE NEGÓCIO</w:t>
+      </w:r>
+    </w:p>
+    <w:p>
+      <w:pPr>
+        <w:spacing w:after="0" w:before="0" w:line="360"/>
+        <w:ind w:firstLine="708"/>
+        <w:jc w:val="both"/>
+      </w:pPr>
+      <w:r>
+        <w:rPr>
+          <w:b w:val="false"/>
+          <w:bCs w:val="false"/>
+          <w:i w:val="false"/>
+          <w:iCs w:val="false"/>
+          <w:sz w:val="24"/>
+          <w:szCs w:val="24"/>
+        </w:rPr>
+        <w:t xml:space="preserve">As regras de negócio expressam as políticas e as restrições da organização que o sistema deve respeitar. As regras a seguir orientam o comportamento esperado do software e são referenciadas pelos requisitos e pelos diagramas apresentados nas seções seguintes.</w:t>
+      </w:r>
+    </w:p>
+    <w:p>
+      <w:pPr>
+        <w:spacing w:after="60" w:before="240" w:line="240"/>
+        <w:jc w:val="center"/>
+      </w:pPr>
+      <w:r>
+        <w:rPr>
+          <w:sz w:val="20"/>
+          <w:szCs w:val="20"/>
+        </w:rPr>
+        <w:t xml:space="preserve">Quadro 1 - Regras de negócio da distribuidora Entrega Expressa</w:t>
       </w:r>
     </w:p>
     <w:tbl>
       <w:tblPr>
         <w:tblW w:type="dxa" w:w="9070"/>
         <w:tblBorders>
-          <w:top w:val="single" w:color="8896A6" w:sz="4"/>
-          <w:left w:val="single" w:color="8896A6" w:sz="4"/>
-          <w:bottom w:val="single" w:color="8896A6" w:sz="4"/>
-          <w:right w:val="single" w:color="8896A6" w:sz="4"/>
-          <w:insideH w:val="single" w:color="8896A6" w:sz="4"/>
-          <w:insideV w:val="single" w:color="8896A6" w:sz="4"/>
+          <w:top w:val="single" w:color="000000" w:sz="4"/>
+          <w:left w:val="single" w:color="000000" w:sz="4"/>
+          <w:bottom w:val="single" w:color="000000" w:sz="4"/>
+          <w:right w:val="single" w:color="000000" w:sz="4"/>
+          <w:insideH w:val="single" w:color="000000" w:sz="4"/>
+          <w:insideV w:val="single" w:color="000000" w:sz="4"/>
         </w:tblBorders>
       </w:tblPr>
       <w:tblGrid>
@@ -1170,7 +1060,7 @@
         <w:tc>
           <w:tcPr>
             <w:tcW w:type="dxa" w:w="1179"/>
-            <w:shd w:fill="DDE5F0" w:color="auto" w:val="clear"/>
+            <w:shd w:fill="E6E6E6" w:color="auto" w:val="clear"/>
             <w:tcMar>
               <w:top w:type="dxa" w:w="60"/>
               <w:left w:type="dxa" w:w="90"/>
@@ -1198,7 +1088,7 @@
         <w:tc>
           <w:tcPr>
             <w:tcW w:type="dxa" w:w="7891"/>
-            <w:shd w:fill="DDE5F0" w:color="auto" w:val="clear"/>
+            <w:shd w:fill="E6E6E6" w:color="auto" w:val="clear"/>
             <w:tcMar>
               <w:top w:type="dxa" w:w="60"/>
               <w:left w:type="dxa" w:w="90"/>
@@ -1898,6 +1788,19 @@
       </w:tr>
     </w:tbl>
     <w:p>
+      <w:pPr>
+        <w:spacing w:after="240" w:before="60" w:line="240"/>
+        <w:jc w:val="center"/>
+      </w:pPr>
+      <w:r>
+        <w:rPr>
+          <w:sz w:val="20"/>
+          <w:szCs w:val="20"/>
+        </w:rPr>
+        <w:t xml:space="preserve">Fonte: Elaborado pelos autores (2026).</w:t>
+      </w:r>
+    </w:p>
+    <w:p>
       <w:r>
         <w:br w:type="page"/>
       </w:r>
@@ -1905,22 +1808,24 @@
     <w:p>
       <w:pPr>
         <w:pStyle w:val="Heading1"/>
-        <w:spacing w:after="240" w:before="360" w:line="360"/>
+        <w:spacing w:after="360" w:before="0" w:line="360"/>
+        <w:jc w:val="left"/>
       </w:pPr>
       <w:r>
         <w:rPr>
           <w:b/>
           <w:bCs/>
-          <w:sz w:val="26"/>
-          <w:szCs w:val="26"/>
+          <w:caps/>
+          <w:sz w:val="24"/>
+          <w:szCs w:val="24"/>
         </w:rPr>
-        <w:t xml:space="preserve">3. REQUISITOS FUNCIONAIS</w:t>
-      </w:r>
-    </w:p>
-    <w:p>
-      <w:pPr>
-        <w:spacing w:after="120" w:line="360"/>
-        <w:ind w:firstLine="0"/>
+        <w:t xml:space="preserve">3 REQUISITOS FUNCIONAIS</w:t>
+      </w:r>
+    </w:p>
+    <w:p>
+      <w:pPr>
+        <w:spacing w:after="0" w:before="0" w:line="360"/>
+        <w:ind w:firstLine="708"/>
         <w:jc w:val="both"/>
       </w:pPr>
       <w:r>
@@ -1932,19 +1837,32 @@
           <w:sz w:val="24"/>
           <w:szCs w:val="24"/>
         </w:rPr>
-        <w:t xml:space="preserve">Os requisitos funcionais descrevem o que o sistema deve fazer para atender à operação do centro de distribuição.</w:t>
+        <w:t xml:space="preserve">Os requisitos funcionais descrevem os serviços que o sistema deve oferecer, isto é, como ele deve reagir a entradas específicas e como deve se comportar em determinadas situações (SOMMERVILLE, 2019). O Quadro 2 relaciona os vinte e cinco requisitos funcionais levantados, com o ator principal responsável e a prioridade atribuída.</w:t>
+      </w:r>
+    </w:p>
+    <w:p>
+      <w:pPr>
+        <w:spacing w:after="60" w:before="240" w:line="240"/>
+        <w:jc w:val="center"/>
+      </w:pPr>
+      <w:r>
+        <w:rPr>
+          <w:sz w:val="20"/>
+          <w:szCs w:val="20"/>
+        </w:rPr>
+        <w:t xml:space="preserve">Quadro 2 - Requisitos funcionais do sistema</w:t>
       </w:r>
     </w:p>
     <w:tbl>
       <w:tblPr>
         <w:tblW w:type="dxa" w:w="9070"/>
         <w:tblBorders>
-          <w:top w:val="single" w:color="8896A6" w:sz="4"/>
-          <w:left w:val="single" w:color="8896A6" w:sz="4"/>
-          <w:bottom w:val="single" w:color="8896A6" w:sz="4"/>
-          <w:right w:val="single" w:color="8896A6" w:sz="4"/>
-          <w:insideH w:val="single" w:color="8896A6" w:sz="4"/>
-          <w:insideV w:val="single" w:color="8896A6" w:sz="4"/>
+          <w:top w:val="single" w:color="000000" w:sz="4"/>
+          <w:left w:val="single" w:color="000000" w:sz="4"/>
+          <w:bottom w:val="single" w:color="000000" w:sz="4"/>
+          <w:right w:val="single" w:color="000000" w:sz="4"/>
+          <w:insideH w:val="single" w:color="000000" w:sz="4"/>
+          <w:insideV w:val="single" w:color="000000" w:sz="4"/>
         </w:tblBorders>
       </w:tblPr>
       <w:tblGrid>
@@ -1961,7 +1879,7 @@
         <w:tc>
           <w:tcPr>
             <w:tcW w:type="dxa" w:w="749"/>
-            <w:shd w:fill="DDE5F0" w:color="auto" w:val="clear"/>
+            <w:shd w:fill="E6E6E6" w:color="auto" w:val="clear"/>
             <w:tcMar>
               <w:top w:type="dxa" w:w="60"/>
               <w:left w:type="dxa" w:w="90"/>
@@ -1989,7 +1907,7 @@
         <w:tc>
           <w:tcPr>
             <w:tcW w:type="dxa" w:w="1914"/>
-            <w:shd w:fill="DDE5F0" w:color="auto" w:val="clear"/>
+            <w:shd w:fill="E6E6E6" w:color="auto" w:val="clear"/>
             <w:tcMar>
               <w:top w:type="dxa" w:w="60"/>
               <w:left w:type="dxa" w:w="90"/>
@@ -2017,7 +1935,7 @@
         <w:tc>
           <w:tcPr>
             <w:tcW w:type="dxa" w:w="3828"/>
-            <w:shd w:fill="DDE5F0" w:color="auto" w:val="clear"/>
+            <w:shd w:fill="E6E6E6" w:color="auto" w:val="clear"/>
             <w:tcMar>
               <w:top w:type="dxa" w:w="60"/>
               <w:left w:type="dxa" w:w="90"/>
@@ -2045,7 +1963,7 @@
         <w:tc>
           <w:tcPr>
             <w:tcW w:type="dxa" w:w="1664"/>
-            <w:shd w:fill="DDE5F0" w:color="auto" w:val="clear"/>
+            <w:shd w:fill="E6E6E6" w:color="auto" w:val="clear"/>
             <w:tcMar>
               <w:top w:type="dxa" w:w="60"/>
               <w:left w:type="dxa" w:w="90"/>
@@ -2073,7 +1991,7 @@
         <w:tc>
           <w:tcPr>
             <w:tcW w:type="dxa" w:w="915"/>
-            <w:shd w:fill="DDE5F0" w:color="auto" w:val="clear"/>
+            <w:shd w:fill="E6E6E6" w:color="auto" w:val="clear"/>
             <w:tcMar>
               <w:top w:type="dxa" w:w="60"/>
               <w:left w:type="dxa" w:w="90"/>
@@ -5526,6 +5444,19 @@
       </w:tr>
     </w:tbl>
     <w:p>
+      <w:pPr>
+        <w:spacing w:after="240" w:before="60" w:line="240"/>
+        <w:jc w:val="center"/>
+      </w:pPr>
+      <w:r>
+        <w:rPr>
+          <w:sz w:val="20"/>
+          <w:szCs w:val="20"/>
+        </w:rPr>
+        <w:t xml:space="preserve">Fonte: Elaborado pelos autores (2026).</w:t>
+      </w:r>
+    </w:p>
+    <w:p>
       <w:r>
         <w:br w:type="page"/>
       </w:r>
@@ -5533,22 +5464,24 @@
     <w:p>
       <w:pPr>
         <w:pStyle w:val="Heading1"/>
-        <w:spacing w:after="240" w:before="360" w:line="360"/>
+        <w:spacing w:after="360" w:before="0" w:line="360"/>
+        <w:jc w:val="left"/>
       </w:pPr>
       <w:r>
         <w:rPr>
           <w:b/>
           <w:bCs/>
-          <w:sz w:val="26"/>
-          <w:szCs w:val="26"/>
+          <w:caps/>
+          <w:sz w:val="24"/>
+          <w:szCs w:val="24"/>
         </w:rPr>
-        <w:t xml:space="preserve">4. REQUISITOS NÃO FUNCIONAIS</w:t>
-      </w:r>
-    </w:p>
-    <w:p>
-      <w:pPr>
-        <w:spacing w:after="120" w:line="360"/>
-        <w:ind w:firstLine="0"/>
+        <w:t xml:space="preserve">4 REQUISITOS NÃO FUNCIONAIS</w:t>
+      </w:r>
+    </w:p>
+    <w:p>
+      <w:pPr>
+        <w:spacing w:after="0" w:before="0" w:line="360"/>
+        <w:ind w:firstLine="708"/>
         <w:jc w:val="both"/>
       </w:pPr>
       <w:r>
@@ -5560,19 +5493,32 @@
           <w:sz w:val="24"/>
           <w:szCs w:val="24"/>
         </w:rPr>
-        <w:t xml:space="preserve">Os requisitos não funcionais estabelecem as restrições de qualidade, desempenho, segurança e operação do sistema.</w:t>
+        <w:t xml:space="preserve">Os requisitos não funcionais expressam restrições sobre os serviços oferecidos e sobre o processo de desenvolvimento, aplicando-se ao sistema como um todo (SOMMERVILLE, 2019). O Quadro 3 apresenta os requisitos de qualidade, desempenho, segurança e operação estabelecidos para a solução.</w:t>
+      </w:r>
+    </w:p>
+    <w:p>
+      <w:pPr>
+        <w:spacing w:after="60" w:before="240" w:line="240"/>
+        <w:jc w:val="center"/>
+      </w:pPr>
+      <w:r>
+        <w:rPr>
+          <w:sz w:val="20"/>
+          <w:szCs w:val="20"/>
+        </w:rPr>
+        <w:t xml:space="preserve">Quadro 3 - Requisitos não funcionais do sistema</w:t>
       </w:r>
     </w:p>
     <w:tbl>
       <w:tblPr>
         <w:tblW w:type="dxa" w:w="9070"/>
         <w:tblBorders>
-          <w:top w:val="single" w:color="8896A6" w:sz="4"/>
-          <w:left w:val="single" w:color="8896A6" w:sz="4"/>
-          <w:bottom w:val="single" w:color="8896A6" w:sz="4"/>
-          <w:right w:val="single" w:color="8896A6" w:sz="4"/>
-          <w:insideH w:val="single" w:color="8896A6" w:sz="4"/>
-          <w:insideV w:val="single" w:color="8896A6" w:sz="4"/>
+          <w:top w:val="single" w:color="000000" w:sz="4"/>
+          <w:left w:val="single" w:color="000000" w:sz="4"/>
+          <w:bottom w:val="single" w:color="000000" w:sz="4"/>
+          <w:right w:val="single" w:color="000000" w:sz="4"/>
+          <w:insideH w:val="single" w:color="000000" w:sz="4"/>
+          <w:insideV w:val="single" w:color="000000" w:sz="4"/>
         </w:tblBorders>
       </w:tblPr>
       <w:tblGrid>
@@ -5587,7 +5533,7 @@
         <w:tc>
           <w:tcPr>
             <w:tcW w:type="dxa" w:w="907"/>
-            <w:shd w:fill="DDE5F0" w:color="auto" w:val="clear"/>
+            <w:shd w:fill="E6E6E6" w:color="auto" w:val="clear"/>
             <w:tcMar>
               <w:top w:type="dxa" w:w="60"/>
               <w:left w:type="dxa" w:w="90"/>
@@ -5615,7 +5561,7 @@
         <w:tc>
           <w:tcPr>
             <w:tcW w:type="dxa" w:w="1633"/>
-            <w:shd w:fill="DDE5F0" w:color="auto" w:val="clear"/>
+            <w:shd w:fill="E6E6E6" w:color="auto" w:val="clear"/>
             <w:tcMar>
               <w:top w:type="dxa" w:w="60"/>
               <w:left w:type="dxa" w:w="90"/>
@@ -5643,7 +5589,7 @@
         <w:tc>
           <w:tcPr>
             <w:tcW w:type="dxa" w:w="6530"/>
-            <w:shd w:fill="DDE5F0" w:color="auto" w:val="clear"/>
+            <w:shd w:fill="E6E6E6" w:color="auto" w:val="clear"/>
             <w:tcMar>
               <w:top w:type="dxa" w:w="60"/>
               <w:left w:type="dxa" w:w="90"/>
@@ -6916,6 +6862,19 @@
       </w:tr>
     </w:tbl>
     <w:p>
+      <w:pPr>
+        <w:spacing w:after="240" w:before="60" w:line="240"/>
+        <w:jc w:val="center"/>
+      </w:pPr>
+      <w:r>
+        <w:rPr>
+          <w:sz w:val="20"/>
+          <w:szCs w:val="20"/>
+        </w:rPr>
+        <w:t xml:space="preserve">Fonte: Elaborado pelos autores (2026).</w:t>
+      </w:r>
+    </w:p>
+    <w:p>
       <w:r>
         <w:br w:type="page"/>
       </w:r>
@@ -6923,22 +6882,24 @@
     <w:p>
       <w:pPr>
         <w:pStyle w:val="Heading1"/>
-        <w:spacing w:after="240" w:before="360" w:line="360"/>
+        <w:spacing w:after="360" w:before="0" w:line="360"/>
+        <w:jc w:val="left"/>
       </w:pPr>
       <w:r>
         <w:rPr>
           <w:b/>
           <w:bCs/>
-          <w:sz w:val="26"/>
-          <w:szCs w:val="26"/>
+          <w:caps/>
+          <w:sz w:val="24"/>
+          <w:szCs w:val="24"/>
         </w:rPr>
-        <w:t xml:space="preserve">5. ATORES DO SISTEMA</w:t>
-      </w:r>
-    </w:p>
-    <w:p>
-      <w:pPr>
-        <w:spacing w:after="120" w:line="360"/>
-        <w:ind w:firstLine="0"/>
+        <w:t xml:space="preserve">5 ATORES DO SISTEMA</w:t>
+      </w:r>
+    </w:p>
+    <w:p>
+      <w:pPr>
+        <w:spacing w:after="0" w:before="0" w:line="360"/>
+        <w:ind w:firstLine="708"/>
         <w:jc w:val="both"/>
       </w:pPr>
       <w:r>
@@ -6950,19 +6911,32 @@
           <w:sz w:val="24"/>
           <w:szCs w:val="24"/>
         </w:rPr>
-        <w:t xml:space="preserve">Foram identificados onze atores, entre usuários internos do centro de distribuição, o cliente final e os sistemas externos que trocam informações com a solução.</w:t>
+        <w:t xml:space="preserve">Ator é o papel desempenhado por um usuário ou por outro sistema que interage com o software modelado, não correspondendo necessariamente a uma pessoa específica (GUEDES, 2018). Foram identificados onze atores, entre usuários internos do centro de distribuição, o cliente final e os sistemas externos que trocam informações com a solução, conforme o Quadro 4.</w:t>
+      </w:r>
+    </w:p>
+    <w:p>
+      <w:pPr>
+        <w:spacing w:after="60" w:before="240" w:line="240"/>
+        <w:jc w:val="center"/>
+      </w:pPr>
+      <w:r>
+        <w:rPr>
+          <w:sz w:val="20"/>
+          <w:szCs w:val="20"/>
+        </w:rPr>
+        <w:t xml:space="preserve">Quadro 4 - Atores identificados</w:t>
       </w:r>
     </w:p>
     <w:tbl>
       <w:tblPr>
         <w:tblW w:type="dxa" w:w="9070"/>
         <w:tblBorders>
-          <w:top w:val="single" w:color="8896A6" w:sz="4"/>
-          <w:left w:val="single" w:color="8896A6" w:sz="4"/>
-          <w:bottom w:val="single" w:color="8896A6" w:sz="4"/>
-          <w:right w:val="single" w:color="8896A6" w:sz="4"/>
-          <w:insideH w:val="single" w:color="8896A6" w:sz="4"/>
-          <w:insideV w:val="single" w:color="8896A6" w:sz="4"/>
+          <w:top w:val="single" w:color="000000" w:sz="4"/>
+          <w:left w:val="single" w:color="000000" w:sz="4"/>
+          <w:bottom w:val="single" w:color="000000" w:sz="4"/>
+          <w:right w:val="single" w:color="000000" w:sz="4"/>
+          <w:insideH w:val="single" w:color="000000" w:sz="4"/>
+          <w:insideV w:val="single" w:color="000000" w:sz="4"/>
         </w:tblBorders>
       </w:tblPr>
       <w:tblGrid>
@@ -6977,7 +6951,7 @@
         <w:tc>
           <w:tcPr>
             <w:tcW w:type="dxa" w:w="2358"/>
-            <w:shd w:fill="DDE5F0" w:color="auto" w:val="clear"/>
+            <w:shd w:fill="E6E6E6" w:color="auto" w:val="clear"/>
             <w:tcMar>
               <w:top w:type="dxa" w:w="60"/>
               <w:left w:type="dxa" w:w="90"/>
@@ -7005,7 +6979,7 @@
         <w:tc>
           <w:tcPr>
             <w:tcW w:type="dxa" w:w="1633"/>
-            <w:shd w:fill="DDE5F0" w:color="auto" w:val="clear"/>
+            <w:shd w:fill="E6E6E6" w:color="auto" w:val="clear"/>
             <w:tcMar>
               <w:top w:type="dxa" w:w="60"/>
               <w:left w:type="dxa" w:w="90"/>
@@ -7033,7 +7007,7 @@
         <w:tc>
           <w:tcPr>
             <w:tcW w:type="dxa" w:w="5079"/>
-            <w:shd w:fill="DDE5F0" w:color="auto" w:val="clear"/>
+            <w:shd w:fill="E6E6E6" w:color="auto" w:val="clear"/>
             <w:tcMar>
               <w:top w:type="dxa" w:w="60"/>
               <w:left w:type="dxa" w:w="90"/>
@@ -7974,6 +7948,19 @@
       </w:tr>
     </w:tbl>
     <w:p>
+      <w:pPr>
+        <w:spacing w:after="240" w:before="60" w:line="240"/>
+        <w:jc w:val="center"/>
+      </w:pPr>
+      <w:r>
+        <w:rPr>
+          <w:sz w:val="20"/>
+          <w:szCs w:val="20"/>
+        </w:rPr>
+        <w:t xml:space="preserve">Fonte: Elaborado pelos autores (2026).</w:t>
+      </w:r>
+    </w:p>
+    <w:p>
       <w:r>
         <w:br w:type="page"/>
       </w:r>
@@ -7981,22 +7968,24 @@
     <w:p>
       <w:pPr>
         <w:pStyle w:val="Heading1"/>
-        <w:spacing w:after="240" w:before="360" w:line="360"/>
+        <w:spacing w:after="360" w:before="0" w:line="360"/>
+        <w:jc w:val="left"/>
       </w:pPr>
       <w:r>
         <w:rPr>
           <w:b/>
           <w:bCs/>
-          <w:sz w:val="26"/>
-          <w:szCs w:val="26"/>
+          <w:caps/>
+          <w:sz w:val="24"/>
+          <w:szCs w:val="24"/>
         </w:rPr>
-        <w:t xml:space="preserve">6. DIAGRAMA DE CASOS DE USO</w:t>
-      </w:r>
-    </w:p>
-    <w:p>
-      <w:pPr>
-        <w:spacing w:after="120" w:line="360"/>
-        <w:ind w:firstLine="0"/>
+        <w:t xml:space="preserve">6 DIAGRAMA DE CASOS DE USO</w:t>
+      </w:r>
+    </w:p>
+    <w:p>
+      <w:pPr>
+        <w:spacing w:after="0" w:before="0" w:line="360"/>
+        <w:ind w:firstLine="708"/>
         <w:jc w:val="both"/>
       </w:pPr>
       <w:r>
@@ -8008,29 +7997,60 @@
           <w:sz w:val="24"/>
           <w:szCs w:val="24"/>
         </w:rPr>
-        <w:t xml:space="preserve">O diagrama a seguir apresenta os onze atores e os vinte e nove casos de uso do sistema, delimitados pela fronteira do centro de distribuição. Os relacionamentos «include» (linhas azuis) indicam funcionalidades de execução obrigatória, reaproveitadas por vários casos de uso; os relacionamentos «extend» (linhas laranja) indicam comportamentos que só ocorrem sob determinada condição. Os perfis de usuário são especializações do ator Usuário do Sistema, o que permite associar o caso de uso de login uma única vez.</w:t>
+        <w:t xml:space="preserve">O diagrama de casos de uso apresenta uma visão externa do sistema, descrevendo suas funcionalidades a partir da perspectiva dos usuários, sem detalhar como elas são implementadas (BOOCH; RUMBAUGH; JACOBSON, 2006). A Figura 1 apresenta os onze atores e os vinte e nove casos de uso do sistema, delimitados pela fronteira do centro de distribuição.</w:t>
+      </w:r>
+    </w:p>
+    <w:p>
+      <w:pPr>
+        <w:spacing w:after="0" w:before="0" w:line="360"/>
+        <w:ind w:firstLine="708"/>
+        <w:jc w:val="both"/>
+      </w:pPr>
+      <w:r>
+        <w:rPr>
+          <w:b w:val="false"/>
+          <w:bCs w:val="false"/>
+          <w:i w:val="false"/>
+          <w:iCs w:val="false"/>
+          <w:sz w:val="24"/>
+          <w:szCs w:val="24"/>
+        </w:rPr>
+        <w:t xml:space="preserve">O relacionamento «include» é utilizado quando um caso de uso precisa obrigatoriamente executar outro para concluir sua função, servindo para reaproveitar funcionalidades comuns e evitar repetições no diagrama. Já o relacionamento «extend» é utilizado quando uma funcionalidade complementa outra e ocorre apenas em situações específicas ou opcionais, isto é, quando a condição de extensão é satisfeita (FOWLER, 2005). No diagrama, ambos são representados por setas tracejadas, identificadas pelos respectivos estereótipos.</w:t>
       </w:r>
     </w:p>
     <w:p>
       <w:pPr>
         <w:sectPr>
-          <w:footerReference w:type="default" r:id="rId7"/>
+          <w:headerReference w:type="default" r:id="rId7"/>
           <w:pgSz w:w="11906" w:h="16838" w:orient="portrait"/>
           <w:pgMar w:top="1700" w:right="1133" w:bottom="1133" w:left="1700" w:header="708" w:footer="708" w:gutter="0"/>
-          <w:pgNumType/>
+          <w:pgNumType w:start="5"/>
           <w:docGrid w:linePitch="360"/>
         </w:sectPr>
       </w:pPr>
     </w:p>
     <w:p>
       <w:pPr>
-        <w:spacing w:after="120" w:before="120"/>
+        <w:spacing w:after="60" w:before="240" w:line="240"/>
+        <w:jc w:val="center"/>
+      </w:pPr>
+      <w:r>
+        <w:rPr>
+          <w:sz w:val="20"/>
+          <w:szCs w:val="20"/>
+        </w:rPr>
+        <w:t xml:space="preserve">Figura 1 - Diagrama de casos de uso do sistema da distribuidora Entrega Expressa</w:t>
+      </w:r>
+    </w:p>
+    <w:p>
+      <w:pPr>
+        <w:spacing w:after="0" w:before="0"/>
         <w:jc w:val="center"/>
       </w:pPr>
       <w:r>
         <w:drawing>
           <wp:inline distT="0" distB="0" distL="0" distR="0">
-            <wp:extent cx="7762875" cy="5467350"/>
+            <wp:extent cx="7248525" cy="5257800"/>
             <wp:effectExtent t="0" r="0" b="0" l="0"/>
             <wp:docPr id="1" name="" descr="" title=""/>
             <wp:cNvGraphicFramePr>
@@ -8055,7 +8075,7 @@
                   <pic:spPr bwMode="auto">
                     <a:xfrm>
                       <a:off x="0" y="0"/>
-                      <a:ext cx="7762875" cy="5467350"/>
+                      <a:ext cx="7248525" cy="5257800"/>
                     </a:xfrm>
                     <a:prstGeom prst="rect">
                       <a:avLst/>
@@ -8070,25 +8090,23 @@
     </w:p>
     <w:p>
       <w:pPr>
-        <w:spacing w:after="240"/>
+        <w:spacing w:after="240" w:before="60" w:line="240"/>
         <w:jc w:val="center"/>
       </w:pPr>
       <w:r>
         <w:rPr>
-          <w:i/>
-          <w:iCs/>
           <w:sz w:val="20"/>
           <w:szCs w:val="20"/>
         </w:rPr>
-        <w:t xml:space="preserve">Figura 1 - Diagrama de Casos de Uso do sistema da distribuidora Entrega Expressa</w:t>
+        <w:t xml:space="preserve">Fonte: Elaborado pelos autores (2026).</w:t>
       </w:r>
     </w:p>
     <w:p>
       <w:pPr>
         <w:sectPr>
-          <w:footerReference w:type="default" r:id="rId8"/>
+          <w:headerReference w:type="default" r:id="rId8"/>
           <w:pgSz w:w="16838" w:h="11906" w:orient="landscape"/>
-          <w:pgMar w:top="1133" w:right="1133" w:bottom="1133" w:left="1133" w:header="708" w:footer="708" w:gutter="0"/>
+          <w:pgMar w:top="1133" w:right="1133" w:bottom="1133" w:left="1700" w:header="708" w:footer="708" w:gutter="0"/>
           <w:pgNumType/>
           <w:docGrid w:linePitch="360"/>
         </w:sectPr>
@@ -8097,7 +8115,8 @@
     <w:p>
       <w:pPr>
         <w:pStyle w:val="Heading2"/>
-        <w:spacing w:after="160" w:before="280" w:line="360"/>
+        <w:spacing w:after="240" w:before="360" w:line="360"/>
+        <w:jc w:val="left"/>
       </w:pPr>
       <w:r>
         <w:rPr>
@@ -8109,16 +8128,47 @@
         <w:t xml:space="preserve">6.1 Descrição dos casos de uso</w:t>
       </w:r>
     </w:p>
+    <w:p>
+      <w:pPr>
+        <w:spacing w:after="0" w:before="0" w:line="360"/>
+        <w:ind w:firstLine="708"/>
+        <w:jc w:val="both"/>
+      </w:pPr>
+      <w:r>
+        <w:rPr>
+          <w:b w:val="false"/>
+          <w:bCs w:val="false"/>
+          <w:i w:val="false"/>
+          <w:iCs w:val="false"/>
+          <w:sz w:val="24"/>
+          <w:szCs w:val="24"/>
+        </w:rPr>
+        <w:t xml:space="preserve">O Quadro 5 relaciona cada caso de uso ao ator que o executa e aos requisitos funcionais que ele atende. Os casos de uso identificados como internos são acionados pelo próprio sistema, a partir de outro caso de uso.</w:t>
+      </w:r>
+    </w:p>
+    <w:p>
+      <w:pPr>
+        <w:spacing w:after="60" w:before="240" w:line="240"/>
+        <w:jc w:val="center"/>
+      </w:pPr>
+      <w:r>
+        <w:rPr>
+          <w:sz w:val="20"/>
+          <w:szCs w:val="20"/>
+        </w:rPr>
+        <w:t xml:space="preserve">Quadro 5 - Casos de uso e requisitos atendidos</w:t>
+      </w:r>
+    </w:p>
     <w:tbl>
       <w:tblPr>
         <w:tblW w:type="dxa" w:w="9070"/>
         <w:tblBorders>
-          <w:top w:val="single" w:color="8896A6" w:sz="4"/>
-          <w:left w:val="single" w:color="8896A6" w:sz="4"/>
-          <w:bottom w:val="single" w:color="8896A6" w:sz="4"/>
-          <w:right w:val="single" w:color="8896A6" w:sz="4"/>
-          <w:insideH w:val="single" w:color="8896A6" w:sz="4"/>
-          <w:insideV w:val="single" w:color="8896A6" w:sz="4"/>
+          <w:top w:val="single" w:color="000000" w:sz="4"/>
+          <w:left w:val="single" w:color="000000" w:sz="4"/>
+          <w:bottom w:val="single" w:color="000000" w:sz="4"/>
+          <w:right w:val="single" w:color="000000" w:sz="4"/>
+          <w:insideH w:val="single" w:color="000000" w:sz="4"/>
+          <w:insideV w:val="single" w:color="000000" w:sz="4"/>
         </w:tblBorders>
       </w:tblPr>
       <w:tblGrid>
@@ -8134,7 +8184,7 @@
         <w:tc>
           <w:tcPr>
             <w:tcW w:type="dxa" w:w="907"/>
-            <w:shd w:fill="DDE5F0" w:color="auto" w:val="clear"/>
+            <w:shd w:fill="E6E6E6" w:color="auto" w:val="clear"/>
             <w:tcMar>
               <w:top w:type="dxa" w:w="60"/>
               <w:left w:type="dxa" w:w="90"/>
@@ -8162,7 +8212,7 @@
         <w:tc>
           <w:tcPr>
             <w:tcW w:type="dxa" w:w="3628"/>
-            <w:shd w:fill="DDE5F0" w:color="auto" w:val="clear"/>
+            <w:shd w:fill="E6E6E6" w:color="auto" w:val="clear"/>
             <w:tcMar>
               <w:top w:type="dxa" w:w="60"/>
               <w:left w:type="dxa" w:w="90"/>
@@ -8190,7 +8240,7 @@
         <w:tc>
           <w:tcPr>
             <w:tcW w:type="dxa" w:w="2993"/>
-            <w:shd w:fill="DDE5F0" w:color="auto" w:val="clear"/>
+            <w:shd w:fill="E6E6E6" w:color="auto" w:val="clear"/>
             <w:tcMar>
               <w:top w:type="dxa" w:w="60"/>
               <w:left w:type="dxa" w:w="90"/>
@@ -8218,7 +8268,7 @@
         <w:tc>
           <w:tcPr>
             <w:tcW w:type="dxa" w:w="1542"/>
-            <w:shd w:fill="DDE5F0" w:color="auto" w:val="clear"/>
+            <w:shd w:fill="E6E6E6" w:color="auto" w:val="clear"/>
             <w:tcMar>
               <w:top w:type="dxa" w:w="60"/>
               <w:left w:type="dxa" w:w="90"/>
@@ -11436,6 +11486,19 @@
       </w:tr>
     </w:tbl>
     <w:p>
+      <w:pPr>
+        <w:spacing w:after="240" w:before="60" w:line="240"/>
+        <w:jc w:val="center"/>
+      </w:pPr>
+      <w:r>
+        <w:rPr>
+          <w:sz w:val="20"/>
+          <w:szCs w:val="20"/>
+        </w:rPr>
+        <w:t xml:space="preserve">Fonte: Elaborado pelos autores (2026).</w:t>
+      </w:r>
+    </w:p>
+    <w:p>
       <w:r>
         <w:br w:type="page"/>
       </w:r>
@@ -11443,7 +11506,8 @@
     <w:p>
       <w:pPr>
         <w:pStyle w:val="Heading2"/>
-        <w:spacing w:after="160" w:before="280" w:line="360"/>
+        <w:spacing w:after="240" w:before="360" w:line="360"/>
+        <w:jc w:val="left"/>
       </w:pPr>
       <w:r>
         <w:rPr>
@@ -11452,13 +11516,13 @@
           <w:sz w:val="24"/>
           <w:szCs w:val="24"/>
         </w:rPr>
-        <w:t xml:space="preserve">6.2 Relacionamentos «include» - execução obrigatória</w:t>
-      </w:r>
-    </w:p>
-    <w:p>
-      <w:pPr>
-        <w:spacing w:after="120" w:line="360"/>
-        <w:ind w:firstLine="0"/>
+        <w:t xml:space="preserve">6.2 Relacionamentos «include»</w:t>
+      </w:r>
+    </w:p>
+    <w:p>
+      <w:pPr>
+        <w:spacing w:after="0" w:before="0" w:line="360"/>
+        <w:ind w:firstLine="708"/>
         <w:jc w:val="both"/>
       </w:pPr>
       <w:r>
@@ -11470,19 +11534,32 @@
           <w:sz w:val="24"/>
           <w:szCs w:val="24"/>
         </w:rPr>
-        <w:t xml:space="preserve">O relacionamento «include» é utilizado quando um caso de uso precisa obrigatoriamente executar outro para concluir sua função, evitando a repetição de funcionalidades comuns no diagrama.</w:t>
+        <w:t xml:space="preserve">O relacionamento de inclusão indica execução obrigatória: sempre que o caso de uso base é executado, o caso de uso incluído também é. O Quadro 6 apresenta as treze inclusões do modelo e a justificativa de cada uma.</w:t>
+      </w:r>
+    </w:p>
+    <w:p>
+      <w:pPr>
+        <w:spacing w:after="60" w:before="240" w:line="240"/>
+        <w:jc w:val="center"/>
+      </w:pPr>
+      <w:r>
+        <w:rPr>
+          <w:sz w:val="20"/>
+          <w:szCs w:val="20"/>
+        </w:rPr>
+        <w:t xml:space="preserve">Quadro 6 - Relacionamentos «include» do modelo</w:t>
       </w:r>
     </w:p>
     <w:tbl>
       <w:tblPr>
         <w:tblW w:type="dxa" w:w="9070"/>
         <w:tblBorders>
-          <w:top w:val="single" w:color="8896A6" w:sz="4"/>
-          <w:left w:val="single" w:color="8896A6" w:sz="4"/>
-          <w:bottom w:val="single" w:color="8896A6" w:sz="4"/>
-          <w:right w:val="single" w:color="8896A6" w:sz="4"/>
-          <w:insideH w:val="single" w:color="8896A6" w:sz="4"/>
-          <w:insideV w:val="single" w:color="8896A6" w:sz="4"/>
+          <w:top w:val="single" w:color="000000" w:sz="4"/>
+          <w:left w:val="single" w:color="000000" w:sz="4"/>
+          <w:bottom w:val="single" w:color="000000" w:sz="4"/>
+          <w:right w:val="single" w:color="000000" w:sz="4"/>
+          <w:insideH w:val="single" w:color="000000" w:sz="4"/>
+          <w:insideV w:val="single" w:color="000000" w:sz="4"/>
         </w:tblBorders>
       </w:tblPr>
       <w:tblGrid>
@@ -11497,7 +11574,7 @@
         <w:tc>
           <w:tcPr>
             <w:tcW w:type="dxa" w:w="2903"/>
-            <w:shd w:fill="DDE5F0" w:color="auto" w:val="clear"/>
+            <w:shd w:fill="E6E6E6" w:color="auto" w:val="clear"/>
             <w:tcMar>
               <w:top w:type="dxa" w:w="60"/>
               <w:left w:type="dxa" w:w="90"/>
@@ -11525,7 +11602,7 @@
         <w:tc>
           <w:tcPr>
             <w:tcW w:type="dxa" w:w="2721"/>
-            <w:shd w:fill="DDE5F0" w:color="auto" w:val="clear"/>
+            <w:shd w:fill="E6E6E6" w:color="auto" w:val="clear"/>
             <w:tcMar>
               <w:top w:type="dxa" w:w="60"/>
               <w:left w:type="dxa" w:w="90"/>
@@ -11546,14 +11623,14 @@
                 <w:sz w:val="20"/>
                 <w:szCs w:val="20"/>
               </w:rPr>
-              <w:t xml:space="preserve">«include»</w:t>
+              <w:t xml:space="preserve">Caso de uso incluído</w:t>
             </w:r>
           </w:p>
         </w:tc>
         <w:tc>
           <w:tcPr>
             <w:tcW w:type="dxa" w:w="3446"/>
-            <w:shd w:fill="DDE5F0" w:color="auto" w:val="clear"/>
+            <w:shd w:fill="E6E6E6" w:color="auto" w:val="clear"/>
             <w:tcMar>
               <w:top w:type="dxa" w:w="60"/>
               <w:left w:type="dxa" w:w="90"/>
@@ -12661,8 +12738,27 @@
     </w:tbl>
     <w:p>
       <w:pPr>
+        <w:spacing w:after="240" w:before="60" w:line="240"/>
+        <w:jc w:val="center"/>
+      </w:pPr>
+      <w:r>
+        <w:rPr>
+          <w:sz w:val="20"/>
+          <w:szCs w:val="20"/>
+        </w:rPr>
+        <w:t xml:space="preserve">Fonte: Elaborado pelos autores (2026).</w:t>
+      </w:r>
+    </w:p>
+    <w:p>
+      <w:r>
+        <w:br w:type="page"/>
+      </w:r>
+    </w:p>
+    <w:p>
+      <w:pPr>
         <w:pStyle w:val="Heading2"/>
-        <w:spacing w:after="160" w:before="280" w:line="360"/>
+        <w:spacing w:after="240" w:before="360" w:line="360"/>
+        <w:jc w:val="left"/>
       </w:pPr>
       <w:r>
         <w:rPr>
@@ -12671,13 +12767,13 @@
           <w:sz w:val="24"/>
           <w:szCs w:val="24"/>
         </w:rPr>
-        <w:t xml:space="preserve">6.3 Relacionamentos «extend» - execução condicional</w:t>
-      </w:r>
-    </w:p>
-    <w:p>
-      <w:pPr>
-        <w:spacing w:after="120" w:line="360"/>
-        <w:ind w:firstLine="0"/>
+        <w:t xml:space="preserve">6.3 Relacionamentos «extend»</w:t>
+      </w:r>
+    </w:p>
+    <w:p>
+      <w:pPr>
+        <w:spacing w:after="0" w:before="0" w:line="360"/>
+        <w:ind w:firstLine="708"/>
         <w:jc w:val="both"/>
       </w:pPr>
       <w:r>
@@ -12689,19 +12785,32 @@
           <w:sz w:val="24"/>
           <w:szCs w:val="24"/>
         </w:rPr>
-        <w:t xml:space="preserve">O relacionamento «extend» é utilizado quando uma funcionalidade complementa outra e ocorre apenas em situações específicas, isto é, quando a condição de extensão é satisfeita.</w:t>
+        <w:t xml:space="preserve">O relacionamento de extensão indica execução condicional: o caso de uso estendido só é executado quando a condição indicada ocorre. O Quadro 7 apresenta as nove extensões do modelo e as respectivas condições.</w:t>
+      </w:r>
+    </w:p>
+    <w:p>
+      <w:pPr>
+        <w:spacing w:after="60" w:before="240" w:line="240"/>
+        <w:jc w:val="center"/>
+      </w:pPr>
+      <w:r>
+        <w:rPr>
+          <w:sz w:val="20"/>
+          <w:szCs w:val="20"/>
+        </w:rPr>
+        <w:t xml:space="preserve">Quadro 7 - Relacionamentos «extend» do modelo</w:t>
       </w:r>
     </w:p>
     <w:tbl>
       <w:tblPr>
         <w:tblW w:type="dxa" w:w="9070"/>
         <w:tblBorders>
-          <w:top w:val="single" w:color="8896A6" w:sz="4"/>
-          <w:left w:val="single" w:color="8896A6" w:sz="4"/>
-          <w:bottom w:val="single" w:color="8896A6" w:sz="4"/>
-          <w:right w:val="single" w:color="8896A6" w:sz="4"/>
-          <w:insideH w:val="single" w:color="8896A6" w:sz="4"/>
-          <w:insideV w:val="single" w:color="8896A6" w:sz="4"/>
+          <w:top w:val="single" w:color="000000" w:sz="4"/>
+          <w:left w:val="single" w:color="000000" w:sz="4"/>
+          <w:bottom w:val="single" w:color="000000" w:sz="4"/>
+          <w:right w:val="single" w:color="000000" w:sz="4"/>
+          <w:insideH w:val="single" w:color="000000" w:sz="4"/>
+          <w:insideV w:val="single" w:color="000000" w:sz="4"/>
         </w:tblBorders>
       </w:tblPr>
       <w:tblGrid>
@@ -12716,7 +12825,7 @@
         <w:tc>
           <w:tcPr>
             <w:tcW w:type="dxa" w:w="2903"/>
-            <w:shd w:fill="DDE5F0" w:color="auto" w:val="clear"/>
+            <w:shd w:fill="E6E6E6" w:color="auto" w:val="clear"/>
             <w:tcMar>
               <w:top w:type="dxa" w:w="60"/>
               <w:left w:type="dxa" w:w="90"/>
@@ -12744,7 +12853,7 @@
         <w:tc>
           <w:tcPr>
             <w:tcW w:type="dxa" w:w="2721"/>
-            <w:shd w:fill="DDE5F0" w:color="auto" w:val="clear"/>
+            <w:shd w:fill="E6E6E6" w:color="auto" w:val="clear"/>
             <w:tcMar>
               <w:top w:type="dxa" w:w="60"/>
               <w:left w:type="dxa" w:w="90"/>
@@ -12765,14 +12874,14 @@
                 <w:sz w:val="20"/>
                 <w:szCs w:val="20"/>
               </w:rPr>
-              <w:t xml:space="preserve">«extend»</w:t>
+              <w:t xml:space="preserve">Extensão</w:t>
             </w:r>
           </w:p>
         </w:tc>
         <w:tc>
           <w:tcPr>
             <w:tcW w:type="dxa" w:w="3446"/>
-            <w:shd w:fill="DDE5F0" w:color="auto" w:val="clear"/>
+            <w:shd w:fill="E6E6E6" w:color="auto" w:val="clear"/>
             <w:tcMar>
               <w:top w:type="dxa" w:w="60"/>
               <w:left w:type="dxa" w:w="90"/>
@@ -12793,7 +12902,7 @@
                 <w:sz w:val="20"/>
                 <w:szCs w:val="20"/>
               </w:rPr>
-              <w:t xml:space="preserve">Condição</w:t>
+              <w:t xml:space="preserve">Condição de extensão</w:t>
             </w:r>
           </w:p>
         </w:tc>
@@ -13548,8 +13657,22 @@
     </w:tbl>
     <w:p>
       <w:pPr>
+        <w:spacing w:after="240" w:before="60" w:line="240"/>
+        <w:jc w:val="center"/>
+      </w:pPr>
+      <w:r>
+        <w:rPr>
+          <w:sz w:val="20"/>
+          <w:szCs w:val="20"/>
+        </w:rPr>
+        <w:t xml:space="preserve">Fonte: Elaborado pelos autores (2026).</w:t>
+      </w:r>
+    </w:p>
+    <w:p>
+      <w:pPr>
         <w:pStyle w:val="Heading2"/>
-        <w:spacing w:after="160" w:before="280" w:line="360"/>
+        <w:spacing w:after="240" w:before="360" w:line="360"/>
+        <w:jc w:val="left"/>
       </w:pPr>
       <w:r>
         <w:rPr>
@@ -13563,8 +13686,8 @@
     </w:p>
     <w:p>
       <w:pPr>
-        <w:spacing w:after="120" w:line="360"/>
-        <w:ind w:firstLine="0"/>
+        <w:spacing w:after="0" w:before="0" w:line="360"/>
+        <w:ind w:firstLine="708"/>
         <w:jc w:val="both"/>
       </w:pPr>
       <w:r>
@@ -13576,7 +13699,7 @@
           <w:sz w:val="24"/>
           <w:szCs w:val="24"/>
         </w:rPr>
-        <w:t xml:space="preserve">Cliente, Funcionário do Estoque, Operador de Separação, Operador de Expedição, Comprador, Gerente de Operações e Administrador do Sistema são especializações do ator Usuário do Sistema. Dessa forma, o caso de uso UC01 - Efetuar Login é associado uma única vez ao ator generalizado, em vez de ser repetido para cada perfil.</w:t>
+        <w:t xml:space="preserve">Cliente, Funcionário do Estoque, Operador de Separação, Operador de Expedição, Comprador, Gerente de Operações e Administrador do Sistema são especializações do ator Usuário do Sistema. Dessa forma, o caso de uso UC01 - Efetuar Login é associado uma única vez ao ator generalizado, em vez de ser repetido para cada perfil, o que simplifica o diagrama sem perda de informação.</w:t>
       </w:r>
     </w:p>
     <w:p>
@@ -13587,22 +13710,24 @@
     <w:p>
       <w:pPr>
         <w:pStyle w:val="Heading1"/>
-        <w:spacing w:after="240" w:before="360" w:line="360"/>
+        <w:spacing w:after="360" w:before="0" w:line="360"/>
+        <w:jc w:val="left"/>
       </w:pPr>
       <w:r>
         <w:rPr>
           <w:b/>
           <w:bCs/>
-          <w:sz w:val="26"/>
-          <w:szCs w:val="26"/>
+          <w:caps/>
+          <w:sz w:val="24"/>
+          <w:szCs w:val="24"/>
         </w:rPr>
-        <w:t xml:space="preserve">7. DIAGRAMAS DE ATIVIDADES</w:t>
-      </w:r>
-    </w:p>
-    <w:p>
-      <w:pPr>
-        <w:spacing w:after="120" w:line="360"/>
-        <w:ind w:firstLine="0"/>
+        <w:t xml:space="preserve">7 DIAGRAMAS DE ATIVIDADES</w:t>
+      </w:r>
+    </w:p>
+    <w:p>
+      <w:pPr>
+        <w:spacing w:after="0" w:before="0" w:line="360"/>
+        <w:ind w:firstLine="708"/>
         <w:jc w:val="both"/>
       </w:pPr>
       <w:r>
@@ -13614,7 +13739,7 @@
           <w:sz w:val="24"/>
           <w:szCs w:val="24"/>
         </w:rPr>
-        <w:t xml:space="preserve">Os diagramas desta seção utilizam a notação UML de atividades: nó inicial (círculo preenchido), ações (retângulos arredondados), nós de decisão (losangos) com as condições de guarda indicadas nos fluxos de saída e nó final (círculo com anel). São apresentados os oito processos essenciais do sistema.</w:t>
+        <w:t xml:space="preserve">O diagrama de atividades descreve o fluxo de controle de um processo, evidenciando a sequência das ações, as decisões tomadas e os caminhos alternativos (GUEDES, 2018). Os diagramas desta seção utilizam a notação da UML 2.5.1 (OMG, 2017): nó inicial representado por um círculo preenchido, ações representadas por retângulos arredondados, nós de decisão representados por losangos, com as condições de guarda indicadas nos fluxos de saída, e nó final representado por um círculo com anel. São apresentados os oito processos essenciais do sistema.</w:t>
       </w:r>
     </w:p>
     <w:p>
@@ -13625,7 +13750,8 @@
     <w:p>
       <w:pPr>
         <w:pStyle w:val="Heading2"/>
-        <w:spacing w:after="160" w:before="280" w:line="360"/>
+        <w:spacing w:after="240" w:before="360" w:line="360"/>
+        <w:jc w:val="left"/>
       </w:pPr>
       <w:r>
         <w:rPr>
@@ -13639,8 +13765,8 @@
     </w:p>
     <w:p>
       <w:pPr>
-        <w:spacing w:after="120" w:line="360"/>
-        <w:ind w:firstLine="0"/>
+        <w:spacing w:after="0" w:before="0" w:line="360"/>
+        <w:ind w:firstLine="708"/>
         <w:jc w:val="both"/>
       </w:pPr>
       <w:r>
@@ -13657,13 +13783,26 @@
     </w:p>
     <w:p>
       <w:pPr>
-        <w:spacing w:after="120" w:before="120"/>
+        <w:spacing w:after="60" w:before="240" w:line="240"/>
+        <w:jc w:val="center"/>
+      </w:pPr>
+      <w:r>
+        <w:rPr>
+          <w:sz w:val="20"/>
+          <w:szCs w:val="20"/>
+        </w:rPr>
+        <w:t xml:space="preserve">Figura 2 - Diagrama de atividades do processo de login</w:t>
+      </w:r>
+    </w:p>
+    <w:p>
+      <w:pPr>
+        <w:spacing w:after="0" w:before="0"/>
         <w:jc w:val="center"/>
       </w:pPr>
       <w:r>
         <w:drawing>
           <wp:inline distT="0" distB="0" distL="0" distR="0">
-            <wp:extent cx="5219700" cy="7019925"/>
+            <wp:extent cx="4981575" cy="6696075"/>
             <wp:effectExtent t="0" r="0" b="0" l="0"/>
             <wp:docPr id="1" name="" descr="" title=""/>
             <wp:cNvGraphicFramePr>
@@ -13688,7 +13827,7 @@
                   <pic:spPr bwMode="auto">
                     <a:xfrm>
                       <a:off x="0" y="0"/>
-                      <a:ext cx="5219700" cy="7019925"/>
+                      <a:ext cx="4981575" cy="6696075"/>
                     </a:xfrm>
                     <a:prstGeom prst="rect">
                       <a:avLst/>
@@ -13703,17 +13842,15 @@
     </w:p>
     <w:p>
       <w:pPr>
-        <w:spacing w:after="240"/>
+        <w:spacing w:after="240" w:before="60" w:line="240"/>
         <w:jc w:val="center"/>
       </w:pPr>
       <w:r>
         <w:rPr>
-          <w:i/>
-          <w:iCs/>
           <w:sz w:val="20"/>
           <w:szCs w:val="20"/>
         </w:rPr>
-        <w:t xml:space="preserve">Figura 2 - Diagrama de Atividades: Processo de Login</w:t>
+        <w:t xml:space="preserve">Fonte: Elaborado pelos autores (2026).</w:t>
       </w:r>
     </w:p>
     <w:p>
@@ -13724,7 +13861,8 @@
     <w:p>
       <w:pPr>
         <w:pStyle w:val="Heading2"/>
-        <w:spacing w:after="160" w:before="280" w:line="360"/>
+        <w:spacing w:after="240" w:before="360" w:line="360"/>
+        <w:jc w:val="left"/>
       </w:pPr>
       <w:r>
         <w:rPr>
@@ -13738,8 +13876,8 @@
     </w:p>
     <w:p>
       <w:pPr>
-        <w:spacing w:after="120" w:line="360"/>
-        <w:ind w:firstLine="0"/>
+        <w:spacing w:after="0" w:before="0" w:line="360"/>
+        <w:ind w:firstLine="708"/>
         <w:jc w:val="both"/>
       </w:pPr>
       <w:r>
@@ -13756,13 +13894,26 @@
     </w:p>
     <w:p>
       <w:pPr>
-        <w:spacing w:after="120" w:before="120"/>
+        <w:spacing w:after="60" w:before="240" w:line="240"/>
+        <w:jc w:val="center"/>
+      </w:pPr>
+      <w:r>
+        <w:rPr>
+          <w:sz w:val="20"/>
+          <w:szCs w:val="20"/>
+        </w:rPr>
+        <w:t xml:space="preserve">Figura 3 - Diagrama de atividades do recebimento de pedido</w:t>
+      </w:r>
+    </w:p>
+    <w:p>
+      <w:pPr>
+        <w:spacing w:after="0" w:before="0"/>
         <w:jc w:val="center"/>
       </w:pPr>
       <w:r>
         <w:drawing>
           <wp:inline distT="0" distB="0" distL="0" distR="0">
-            <wp:extent cx="3629025" cy="7019925"/>
+            <wp:extent cx="3457575" cy="6696075"/>
             <wp:effectExtent t="0" r="0" b="0" l="0"/>
             <wp:docPr id="1" name="" descr="" title=""/>
             <wp:cNvGraphicFramePr>
@@ -13787,7 +13938,7 @@
                   <pic:spPr bwMode="auto">
                     <a:xfrm>
                       <a:off x="0" y="0"/>
-                      <a:ext cx="3629025" cy="7019925"/>
+                      <a:ext cx="3457575" cy="6696075"/>
                     </a:xfrm>
                     <a:prstGeom prst="rect">
                       <a:avLst/>
@@ -13802,17 +13953,15 @@
     </w:p>
     <w:p>
       <w:pPr>
-        <w:spacing w:after="240"/>
+        <w:spacing w:after="240" w:before="60" w:line="240"/>
         <w:jc w:val="center"/>
       </w:pPr>
       <w:r>
         <w:rPr>
-          <w:i/>
-          <w:iCs/>
           <w:sz w:val="20"/>
           <w:szCs w:val="20"/>
         </w:rPr>
-        <w:t xml:space="preserve">Figura 3 - Diagrama de Atividades: Recebimento de Pedido</w:t>
+        <w:t xml:space="preserve">Fonte: Elaborado pelos autores (2026).</w:t>
       </w:r>
     </w:p>
     <w:p>
@@ -13823,7 +13972,8 @@
     <w:p>
       <w:pPr>
         <w:pStyle w:val="Heading2"/>
-        <w:spacing w:after="160" w:before="280" w:line="360"/>
+        <w:spacing w:after="240" w:before="360" w:line="360"/>
+        <w:jc w:val="left"/>
       </w:pPr>
       <w:r>
         <w:rPr>
@@ -13837,8 +13987,8 @@
     </w:p>
     <w:p>
       <w:pPr>
-        <w:spacing w:after="120" w:line="360"/>
-        <w:ind w:firstLine="0"/>
+        <w:spacing w:after="0" w:before="0" w:line="360"/>
+        <w:ind w:firstLine="708"/>
         <w:jc w:val="both"/>
       </w:pPr>
       <w:r>
@@ -13855,13 +14005,26 @@
     </w:p>
     <w:p>
       <w:pPr>
-        <w:spacing w:after="120" w:before="120"/>
+        <w:spacing w:after="60" w:before="240" w:line="240"/>
+        <w:jc w:val="center"/>
+      </w:pPr>
+      <w:r>
+        <w:rPr>
+          <w:sz w:val="20"/>
+          <w:szCs w:val="20"/>
+        </w:rPr>
+        <w:t xml:space="preserve">Figura 4 - Diagrama de atividades da separação de produtos</w:t>
+      </w:r>
+    </w:p>
+    <w:p>
+      <w:pPr>
+        <w:spacing w:after="0" w:before="0"/>
         <w:jc w:val="center"/>
       </w:pPr>
       <w:r>
         <w:drawing>
           <wp:inline distT="0" distB="0" distL="0" distR="0">
-            <wp:extent cx="2076450" cy="7019925"/>
+            <wp:extent cx="1981200" cy="6696075"/>
             <wp:effectExtent t="0" r="0" b="0" l="0"/>
             <wp:docPr id="1" name="" descr="" title=""/>
             <wp:cNvGraphicFramePr>
@@ -13886,7 +14049,7 @@
                   <pic:spPr bwMode="auto">
                     <a:xfrm>
                       <a:off x="0" y="0"/>
-                      <a:ext cx="2076450" cy="7019925"/>
+                      <a:ext cx="1981200" cy="6696075"/>
                     </a:xfrm>
                     <a:prstGeom prst="rect">
                       <a:avLst/>
@@ -13901,17 +14064,15 @@
     </w:p>
     <w:p>
       <w:pPr>
-        <w:spacing w:after="240"/>
+        <w:spacing w:after="240" w:before="60" w:line="240"/>
         <w:jc w:val="center"/>
       </w:pPr>
       <w:r>
         <w:rPr>
-          <w:i/>
-          <w:iCs/>
           <w:sz w:val="20"/>
           <w:szCs w:val="20"/>
         </w:rPr>
-        <w:t xml:space="preserve">Figura 4 - Diagrama de Atividades: Separação de Produtos</w:t>
+        <w:t xml:space="preserve">Fonte: Elaborado pelos autores (2026).</w:t>
       </w:r>
     </w:p>
     <w:p>
@@ -13922,7 +14083,8 @@
     <w:p>
       <w:pPr>
         <w:pStyle w:val="Heading2"/>
-        <w:spacing w:after="160" w:before="280" w:line="360"/>
+        <w:spacing w:after="240" w:before="360" w:line="360"/>
+        <w:jc w:val="left"/>
       </w:pPr>
       <w:r>
         <w:rPr>
@@ -13936,8 +14098,8 @@
     </w:p>
     <w:p>
       <w:pPr>
-        <w:spacing w:after="120" w:line="360"/>
-        <w:ind w:firstLine="0"/>
+        <w:spacing w:after="0" w:before="0" w:line="360"/>
+        <w:ind w:firstLine="708"/>
         <w:jc w:val="both"/>
       </w:pPr>
       <w:r>
@@ -13954,13 +14116,26 @@
     </w:p>
     <w:p>
       <w:pPr>
-        <w:spacing w:after="120" w:before="120"/>
+        <w:spacing w:after="60" w:before="240" w:line="240"/>
+        <w:jc w:val="center"/>
+      </w:pPr>
+      <w:r>
+        <w:rPr>
+          <w:sz w:val="20"/>
+          <w:szCs w:val="20"/>
+        </w:rPr>
+        <w:t xml:space="preserve">Figura 5 - Diagrama de atividades da embalagem e expedição</w:t>
+      </w:r>
+    </w:p>
+    <w:p>
+      <w:pPr>
+        <w:spacing w:after="0" w:before="0"/>
         <w:jc w:val="center"/>
       </w:pPr>
       <w:r>
         <w:drawing>
           <wp:inline distT="0" distB="0" distL="0" distR="0">
-            <wp:extent cx="1685925" cy="7019925"/>
+            <wp:extent cx="1609725" cy="6696075"/>
             <wp:effectExtent t="0" r="0" b="0" l="0"/>
             <wp:docPr id="1" name="" descr="" title=""/>
             <wp:cNvGraphicFramePr>
@@ -13985,7 +14160,7 @@
                   <pic:spPr bwMode="auto">
                     <a:xfrm>
                       <a:off x="0" y="0"/>
-                      <a:ext cx="1685925" cy="7019925"/>
+                      <a:ext cx="1609725" cy="6696075"/>
                     </a:xfrm>
                     <a:prstGeom prst="rect">
                       <a:avLst/>
@@ -14000,17 +14175,15 @@
     </w:p>
     <w:p>
       <w:pPr>
-        <w:spacing w:after="240"/>
+        <w:spacing w:after="240" w:before="60" w:line="240"/>
         <w:jc w:val="center"/>
       </w:pPr>
       <w:r>
         <w:rPr>
-          <w:i/>
-          <w:iCs/>
           <w:sz w:val="20"/>
           <w:szCs w:val="20"/>
         </w:rPr>
-        <w:t xml:space="preserve">Figura 5 - Diagrama de Atividades: Embalagem e Expedição</w:t>
+        <w:t xml:space="preserve">Fonte: Elaborado pelos autores (2026).</w:t>
       </w:r>
     </w:p>
     <w:p>
@@ -14021,7 +14194,8 @@
     <w:p>
       <w:pPr>
         <w:pStyle w:val="Heading2"/>
-        <w:spacing w:after="160" w:before="280" w:line="360"/>
+        <w:spacing w:after="240" w:before="360" w:line="360"/>
+        <w:jc w:val="left"/>
       </w:pPr>
       <w:r>
         <w:rPr>
@@ -14035,8 +14209,8 @@
     </w:p>
     <w:p>
       <w:pPr>
-        <w:spacing w:after="120" w:line="360"/>
-        <w:ind w:firstLine="0"/>
+        <w:spacing w:after="0" w:before="0" w:line="360"/>
+        <w:ind w:firstLine="708"/>
         <w:jc w:val="both"/>
       </w:pPr>
       <w:r>
@@ -14053,13 +14227,26 @@
     </w:p>
     <w:p>
       <w:pPr>
-        <w:spacing w:after="120" w:before="120"/>
+        <w:spacing w:after="60" w:before="240" w:line="240"/>
+        <w:jc w:val="center"/>
+      </w:pPr>
+      <w:r>
+        <w:rPr>
+          <w:sz w:val="20"/>
+          <w:szCs w:val="20"/>
+        </w:rPr>
+        <w:t xml:space="preserve">Figura 6 - Diagrama de atividades da atualização de estoque</w:t>
+      </w:r>
+    </w:p>
+    <w:p>
+      <w:pPr>
+        <w:spacing w:after="0" w:before="0"/>
         <w:jc w:val="center"/>
       </w:pPr>
       <w:r>
         <w:drawing>
           <wp:inline distT="0" distB="0" distL="0" distR="0">
-            <wp:extent cx="3429000" cy="7019925"/>
+            <wp:extent cx="3276600" cy="6696075"/>
             <wp:effectExtent t="0" r="0" b="0" l="0"/>
             <wp:docPr id="1" name="" descr="" title=""/>
             <wp:cNvGraphicFramePr>
@@ -14084,7 +14271,7 @@
                   <pic:spPr bwMode="auto">
                     <a:xfrm>
                       <a:off x="0" y="0"/>
-                      <a:ext cx="3429000" cy="7019925"/>
+                      <a:ext cx="3276600" cy="6696075"/>
                     </a:xfrm>
                     <a:prstGeom prst="rect">
                       <a:avLst/>
@@ -14099,17 +14286,15 @@
     </w:p>
     <w:p>
       <w:pPr>
-        <w:spacing w:after="240"/>
+        <w:spacing w:after="240" w:before="60" w:line="240"/>
         <w:jc w:val="center"/>
       </w:pPr>
       <w:r>
         <w:rPr>
-          <w:i/>
-          <w:iCs/>
           <w:sz w:val="20"/>
           <w:szCs w:val="20"/>
         </w:rPr>
-        <w:t xml:space="preserve">Figura 6 - Diagrama de Atividades: Atualização de Estoque</w:t>
+        <w:t xml:space="preserve">Fonte: Elaborado pelos autores (2026).</w:t>
       </w:r>
     </w:p>
     <w:p>
@@ -14120,7 +14305,8 @@
     <w:p>
       <w:pPr>
         <w:pStyle w:val="Heading2"/>
-        <w:spacing w:after="160" w:before="280" w:line="360"/>
+        <w:spacing w:after="240" w:before="360" w:line="360"/>
+        <w:jc w:val="left"/>
       </w:pPr>
       <w:r>
         <w:rPr>
@@ -14134,8 +14320,8 @@
     </w:p>
     <w:p>
       <w:pPr>
-        <w:spacing w:after="120" w:line="360"/>
-        <w:ind w:firstLine="0"/>
+        <w:spacing w:after="0" w:before="0" w:line="360"/>
+        <w:ind w:firstLine="708"/>
         <w:jc w:val="both"/>
       </w:pPr>
       <w:r>
@@ -14152,13 +14338,26 @@
     </w:p>
     <w:p>
       <w:pPr>
-        <w:spacing w:after="120" w:before="120"/>
+        <w:spacing w:after="60" w:before="240" w:line="240"/>
+        <w:jc w:val="center"/>
+      </w:pPr>
+      <w:r>
+        <w:rPr>
+          <w:sz w:val="20"/>
+          <w:szCs w:val="20"/>
+        </w:rPr>
+        <w:t xml:space="preserve">Figura 7 - Diagrama de atividades da consulta de rastreamento pelo cliente</w:t>
+      </w:r>
+    </w:p>
+    <w:p>
+      <w:pPr>
+        <w:spacing w:after="0" w:before="0"/>
         <w:jc w:val="center"/>
       </w:pPr>
       <w:r>
         <w:drawing>
           <wp:inline distT="0" distB="0" distL="0" distR="0">
-            <wp:extent cx="3371850" cy="7019925"/>
+            <wp:extent cx="3209925" cy="6696075"/>
             <wp:effectExtent t="0" r="0" b="0" l="0"/>
             <wp:docPr id="1" name="" descr="" title=""/>
             <wp:cNvGraphicFramePr>
@@ -14183,7 +14382,7 @@
                   <pic:spPr bwMode="auto">
                     <a:xfrm>
                       <a:off x="0" y="0"/>
-                      <a:ext cx="3371850" cy="7019925"/>
+                      <a:ext cx="3209925" cy="6696075"/>
                     </a:xfrm>
                     <a:prstGeom prst="rect">
                       <a:avLst/>
@@ -14198,17 +14397,15 @@
     </w:p>
     <w:p>
       <w:pPr>
-        <w:spacing w:after="240"/>
+        <w:spacing w:after="240" w:before="60" w:line="240"/>
         <w:jc w:val="center"/>
       </w:pPr>
       <w:r>
         <w:rPr>
-          <w:i/>
-          <w:iCs/>
           <w:sz w:val="20"/>
           <w:szCs w:val="20"/>
         </w:rPr>
-        <w:t xml:space="preserve">Figura 7 - Diagrama de Atividades: Consulta de Rastreamento pelo Cliente</w:t>
+        <w:t xml:space="preserve">Fonte: Elaborado pelos autores (2026).</w:t>
       </w:r>
     </w:p>
     <w:p>
@@ -14219,7 +14416,8 @@
     <w:p>
       <w:pPr>
         <w:pStyle w:val="Heading2"/>
-        <w:spacing w:after="160" w:before="280" w:line="360"/>
+        <w:spacing w:after="240" w:before="360" w:line="360"/>
+        <w:jc w:val="left"/>
       </w:pPr>
       <w:r>
         <w:rPr>
@@ -14233,8 +14431,8 @@
     </w:p>
     <w:p>
       <w:pPr>
-        <w:spacing w:after="120" w:line="360"/>
-        <w:ind w:firstLine="0"/>
+        <w:spacing w:after="0" w:before="0" w:line="360"/>
+        <w:ind w:firstLine="708"/>
         <w:jc w:val="both"/>
       </w:pPr>
       <w:r>
@@ -14251,13 +14449,26 @@
     </w:p>
     <w:p>
       <w:pPr>
-        <w:spacing w:after="120" w:before="120"/>
+        <w:spacing w:after="60" w:before="240" w:line="240"/>
+        <w:jc w:val="center"/>
+      </w:pPr>
+      <w:r>
+        <w:rPr>
+          <w:sz w:val="20"/>
+          <w:szCs w:val="20"/>
+        </w:rPr>
+        <w:t xml:space="preserve">Figura 8 - Diagrama de atividades da geração de relatórios gerenciais</w:t>
+      </w:r>
+    </w:p>
+    <w:p>
+      <w:pPr>
+        <w:spacing w:after="0" w:before="0"/>
         <w:jc w:val="center"/>
       </w:pPr>
       <w:r>
         <w:drawing>
           <wp:inline distT="0" distB="0" distL="0" distR="0">
-            <wp:extent cx="3324225" cy="7019925"/>
+            <wp:extent cx="3171825" cy="6696075"/>
             <wp:effectExtent t="0" r="0" b="0" l="0"/>
             <wp:docPr id="1" name="" descr="" title=""/>
             <wp:cNvGraphicFramePr>
@@ -14282,7 +14493,7 @@
                   <pic:spPr bwMode="auto">
                     <a:xfrm>
                       <a:off x="0" y="0"/>
-                      <a:ext cx="3324225" cy="7019925"/>
+                      <a:ext cx="3171825" cy="6696075"/>
                     </a:xfrm>
                     <a:prstGeom prst="rect">
                       <a:avLst/>
@@ -14297,17 +14508,15 @@
     </w:p>
     <w:p>
       <w:pPr>
-        <w:spacing w:after="240"/>
+        <w:spacing w:after="240" w:before="60" w:line="240"/>
         <w:jc w:val="center"/>
       </w:pPr>
       <w:r>
         <w:rPr>
-          <w:i/>
-          <w:iCs/>
           <w:sz w:val="20"/>
           <w:szCs w:val="20"/>
         </w:rPr>
-        <w:t xml:space="preserve">Figura 8 - Diagrama de Atividades: Geração de Relatórios Gerenciais</w:t>
+        <w:t xml:space="preserve">Fonte: Elaborado pelos autores (2026).</w:t>
       </w:r>
     </w:p>
     <w:p>
@@ -14318,7 +14527,8 @@
     <w:p>
       <w:pPr>
         <w:pStyle w:val="Heading2"/>
-        <w:spacing w:after="160" w:before="280" w:line="360"/>
+        <w:spacing w:after="240" w:before="360" w:line="360"/>
+        <w:jc w:val="left"/>
       </w:pPr>
       <w:r>
         <w:rPr>
@@ -14332,8 +14542,8 @@
     </w:p>
     <w:p>
       <w:pPr>
-        <w:spacing w:after="120" w:line="360"/>
-        <w:ind w:firstLine="0"/>
+        <w:spacing w:after="0" w:before="0" w:line="360"/>
+        <w:ind w:firstLine="708"/>
         <w:jc w:val="both"/>
       </w:pPr>
       <w:r>
@@ -14350,13 +14560,26 @@
     </w:p>
     <w:p>
       <w:pPr>
-        <w:spacing w:after="120" w:before="120"/>
+        <w:spacing w:after="60" w:before="240" w:line="240"/>
+        <w:jc w:val="center"/>
+      </w:pPr>
+      <w:r>
+        <w:rPr>
+          <w:sz w:val="20"/>
+          <w:szCs w:val="20"/>
+        </w:rPr>
+        <w:t xml:space="preserve">Figura 9 - Diagrama de atividades da reposição de estoque</w:t>
+      </w:r>
+    </w:p>
+    <w:p>
+      <w:pPr>
+        <w:spacing w:after="0" w:before="0"/>
         <w:jc w:val="center"/>
       </w:pPr>
       <w:r>
         <w:drawing>
           <wp:inline distT="0" distB="0" distL="0" distR="0">
-            <wp:extent cx="2562225" cy="7019925"/>
+            <wp:extent cx="2447925" cy="6696075"/>
             <wp:effectExtent t="0" r="0" b="0" l="0"/>
             <wp:docPr id="1" name="" descr="" title=""/>
             <wp:cNvGraphicFramePr>
@@ -14381,7 +14604,7 @@
                   <pic:spPr bwMode="auto">
                     <a:xfrm>
                       <a:off x="0" y="0"/>
-                      <a:ext cx="2562225" cy="7019925"/>
+                      <a:ext cx="2447925" cy="6696075"/>
                     </a:xfrm>
                     <a:prstGeom prst="rect">
                       <a:avLst/>
@@ -14396,17 +14619,15 @@
     </w:p>
     <w:p>
       <w:pPr>
-        <w:spacing w:after="240"/>
+        <w:spacing w:after="240" w:before="60" w:line="240"/>
         <w:jc w:val="center"/>
       </w:pPr>
       <w:r>
         <w:rPr>
-          <w:i/>
-          <w:iCs/>
           <w:sz w:val="20"/>
           <w:szCs w:val="20"/>
         </w:rPr>
-        <w:t xml:space="preserve">Figura 9 - Diagrama de Atividades: Reposição de Estoque</w:t>
+        <w:t xml:space="preserve">Fonte: Elaborado pelos autores (2026).</w:t>
       </w:r>
     </w:p>
     <w:p>
@@ -14417,22 +14638,24 @@
     <w:p>
       <w:pPr>
         <w:pStyle w:val="Heading1"/>
-        <w:spacing w:after="240" w:before="360" w:line="360"/>
+        <w:spacing w:after="360" w:before="0" w:line="360"/>
+        <w:jc w:val="left"/>
       </w:pPr>
       <w:r>
         <w:rPr>
           <w:b/>
           <w:bCs/>
-          <w:sz w:val="26"/>
-          <w:szCs w:val="26"/>
+          <w:caps/>
+          <w:sz w:val="24"/>
+          <w:szCs w:val="24"/>
         </w:rPr>
-        <w:t xml:space="preserve">8. MATRIZ DE RASTREABILIDADE</w:t>
-      </w:r>
-    </w:p>
-    <w:p>
-      <w:pPr>
-        <w:spacing w:after="120" w:line="360"/>
-        <w:ind w:firstLine="0"/>
+        <w:t xml:space="preserve">8 MATRIZ DE RASTREABILIDADE</w:t>
+      </w:r>
+    </w:p>
+    <w:p>
+      <w:pPr>
+        <w:spacing w:after="0" w:before="0" w:line="360"/>
+        <w:ind w:firstLine="708"/>
         <w:jc w:val="both"/>
       </w:pPr>
       <w:r>
@@ -14444,19 +14667,32 @@
           <w:sz w:val="24"/>
           <w:szCs w:val="24"/>
         </w:rPr>
-        <w:t xml:space="preserve">A matriz relaciona cada requisito funcional aos casos de uso que o realizam e aos diagramas de atividades que detalham o seu fluxo, permitindo verificar a cobertura do levantamento.</w:t>
+        <w:t xml:space="preserve">A rastreabilidade permite verificar se todo requisito levantado foi contemplado pelo modelo e localizar rapidamente onde cada funcionalidade é detalhada. O Quadro 8 relaciona cada requisito funcional aos casos de uso que o realizam e aos diagramas de atividades que descrevem o seu fluxo.</w:t>
+      </w:r>
+    </w:p>
+    <w:p>
+      <w:pPr>
+        <w:spacing w:after="60" w:before="240" w:line="240"/>
+        <w:jc w:val="center"/>
+      </w:pPr>
+      <w:r>
+        <w:rPr>
+          <w:sz w:val="20"/>
+          <w:szCs w:val="20"/>
+        </w:rPr>
+        <w:t xml:space="preserve">Quadro 8 - Matriz de rastreabilidade entre requisitos, casos de uso e diagramas</w:t>
       </w:r>
     </w:p>
     <w:tbl>
       <w:tblPr>
         <w:tblW w:type="dxa" w:w="9070"/>
         <w:tblBorders>
-          <w:top w:val="single" w:color="8896A6" w:sz="4"/>
-          <w:left w:val="single" w:color="8896A6" w:sz="4"/>
-          <w:bottom w:val="single" w:color="8896A6" w:sz="4"/>
-          <w:right w:val="single" w:color="8896A6" w:sz="4"/>
-          <w:insideH w:val="single" w:color="8896A6" w:sz="4"/>
-          <w:insideV w:val="single" w:color="8896A6" w:sz="4"/>
+          <w:top w:val="single" w:color="000000" w:sz="4"/>
+          <w:left w:val="single" w:color="000000" w:sz="4"/>
+          <w:bottom w:val="single" w:color="000000" w:sz="4"/>
+          <w:right w:val="single" w:color="000000" w:sz="4"/>
+          <w:insideH w:val="single" w:color="000000" w:sz="4"/>
+          <w:insideV w:val="single" w:color="000000" w:sz="4"/>
         </w:tblBorders>
       </w:tblPr>
       <w:tblGrid>
@@ -14471,7 +14707,7 @@
         <w:tc>
           <w:tcPr>
             <w:tcW w:type="dxa" w:w="2358"/>
-            <w:shd w:fill="DDE5F0" w:color="auto" w:val="clear"/>
+            <w:shd w:fill="E6E6E6" w:color="auto" w:val="clear"/>
             <w:tcMar>
               <w:top w:type="dxa" w:w="60"/>
               <w:left w:type="dxa" w:w="90"/>
@@ -14499,7 +14735,7 @@
         <w:tc>
           <w:tcPr>
             <w:tcW w:type="dxa" w:w="2903"/>
-            <w:shd w:fill="DDE5F0" w:color="auto" w:val="clear"/>
+            <w:shd w:fill="E6E6E6" w:color="auto" w:val="clear"/>
             <w:tcMar>
               <w:top w:type="dxa" w:w="60"/>
               <w:left w:type="dxa" w:w="90"/>
@@ -14527,7 +14763,7 @@
         <w:tc>
           <w:tcPr>
             <w:tcW w:type="dxa" w:w="3809"/>
-            <w:shd w:fill="DDE5F0" w:color="auto" w:val="clear"/>
+            <w:shd w:fill="E6E6E6" w:color="auto" w:val="clear"/>
             <w:tcMar>
               <w:top w:type="dxa" w:w="60"/>
               <w:left w:type="dxa" w:w="90"/>
@@ -15801,22 +16037,42 @@
     </w:tbl>
     <w:p>
       <w:pPr>
+        <w:spacing w:after="240" w:before="60" w:line="240"/>
+        <w:jc w:val="center"/>
+      </w:pPr>
+      <w:r>
+        <w:rPr>
+          <w:sz w:val="20"/>
+          <w:szCs w:val="20"/>
+        </w:rPr>
+        <w:t xml:space="preserve">Fonte: Elaborado pelos autores (2026).</w:t>
+      </w:r>
+    </w:p>
+    <w:p>
+      <w:r>
+        <w:br w:type="page"/>
+      </w:r>
+    </w:p>
+    <w:p>
+      <w:pPr>
         <w:pStyle w:val="Heading1"/>
-        <w:spacing w:after="240" w:before="360" w:line="360"/>
+        <w:spacing w:after="360" w:before="0" w:line="360"/>
+        <w:jc w:val="left"/>
       </w:pPr>
       <w:r>
         <w:rPr>
           <w:b/>
           <w:bCs/>
-          <w:sz w:val="26"/>
-          <w:szCs w:val="26"/>
+          <w:caps/>
+          <w:sz w:val="24"/>
+          <w:szCs w:val="24"/>
         </w:rPr>
-        <w:t xml:space="preserve">9. CONSIDERAÇÕES FINAIS</w:t>
-      </w:r>
-    </w:p>
-    <w:p>
-      <w:pPr>
-        <w:spacing w:after="120" w:line="360"/>
+        <w:t xml:space="preserve">9 CONSIDERAÇÕES FINAIS</w:t>
+      </w:r>
+    </w:p>
+    <w:p>
+      <w:pPr>
+        <w:spacing w:after="0" w:before="0" w:line="360"/>
         <w:ind w:firstLine="708"/>
         <w:jc w:val="both"/>
       </w:pPr>
@@ -15829,12 +16085,12 @@
           <w:sz w:val="24"/>
           <w:szCs w:val="24"/>
         </w:rPr>
-        <w:t xml:space="preserve">A modelagem apresentada cobre todo o ciclo operacional descrito pela Entrega Expressa, do recebimento automático do pedido até a confirmação da entrega pela transportadora, tratando explicitamente as duas situações críticas relatadas pela empresa: a falta de estoque, que passa a colocar o pedido em condição pendente com alerta de reposição e liberação automática posterior, e a ausência de rastreabilidade, resolvida pelo registro obrigatório de todas as movimentações.</w:t>
-      </w:r>
-    </w:p>
-    <w:p>
-      <w:pPr>
-        <w:spacing w:after="120" w:line="360"/>
+        <w:t xml:space="preserve">A modelagem apresentada cobre todo o ciclo operacional descrito pela Entrega Expressa, do recebimento automático do pedido enviado pelas plataformas de venda até a confirmação da entrega pela transportadora, tratando explicitamente as duas situações críticas relatadas pela empresa: a falta de estoque, que passa a colocar o pedido em condição pendente, com alerta de reposição e liberação automática posterior, e a ausência de rastreabilidade, resolvida pelo registro obrigatório de todas as movimentações.</w:t>
+      </w:r>
+    </w:p>
+    <w:p>
+      <w:pPr>
+        <w:spacing w:after="0" w:before="0" w:line="360"/>
         <w:ind w:firstLine="708"/>
         <w:jc w:val="both"/>
       </w:pPr>
@@ -15847,12 +16103,12 @@
           <w:sz w:val="24"/>
           <w:szCs w:val="24"/>
         </w:rPr>
-        <w:t xml:space="preserve">Os relacionamentos «include» e «extend» foram empregados conforme sua finalidade: o primeiro para funcionalidades obrigatórias e reaproveitadas, como a validação de credenciais, a atualização de estoque e o registro no histórico; o segundo para comportamentos condicionais, como a marcação de pedido pendente, o registro de divergências e a exportação de relatórios.</w:t>
-      </w:r>
-    </w:p>
-    <w:p>
-      <w:pPr>
-        <w:spacing w:after="120" w:line="360"/>
+        <w:t xml:space="preserve">Os relacionamentos «include» e «extend» foram empregados conforme sua finalidade: o primeiro para funcionalidades obrigatórias e reaproveitadas, como a validação de credenciais, a atualização de estoque e o registro no histórico; o segundo para comportamentos condicionais, como a marcação de pedido pendente, o registro de divergências e a exportação de relatórios. A matriz de rastreabilidade demonstra que os vinte e cinco requisitos funcionais estão cobertos pelos casos de uso e detalhados pelos diagramas de atividades.</w:t>
+      </w:r>
+    </w:p>
+    <w:p>
+      <w:pPr>
+        <w:spacing w:after="0" w:before="0" w:line="360"/>
         <w:ind w:firstLine="708"/>
         <w:jc w:val="both"/>
       </w:pPr>
@@ -15865,11 +16121,266 @@
           <w:sz w:val="24"/>
           <w:szCs w:val="24"/>
         </w:rPr>
-        <w:t xml:space="preserve">Como evolução, recomenda-se a integração com o ERP para emissão de nota fiscal, a adoção de coletores móveis na separação e a construção de um painel de indicadores em tempo real para a gerência de operações.</w:t>
+        <w:t xml:space="preserve">Como evolução do trabalho, recomenda-se a integração com o sistema de gestão empresarial para emissão de nota fiscal, a adoção de coletores móveis na separação dos produtos e a construção de um painel de indicadores em tempo real para a gerência de operações. Recomenda-se, ainda, a elaboração dos diagramas de classes e de sequência, de modo a avançar da análise para o projeto do sistema.</w:t>
+      </w:r>
+    </w:p>
+    <w:p>
+      <w:r>
+        <w:br w:type="page"/>
+      </w:r>
+    </w:p>
+    <w:p>
+      <w:pPr>
+        <w:spacing w:after="360" w:line="360"/>
+        <w:jc w:val="center"/>
+      </w:pPr>
+      <w:r>
+        <w:rPr>
+          <w:b/>
+          <w:bCs/>
+          <w:caps/>
+          <w:sz w:val="24"/>
+          <w:szCs w:val="24"/>
+        </w:rPr>
+        <w:t xml:space="preserve">Referências</w:t>
+      </w:r>
+    </w:p>
+    <w:p>
+      <w:pPr>
+        <w:spacing w:after="240" w:line="240"/>
+        <w:jc w:val="left"/>
+      </w:pPr>
+      <w:r>
+        <w:rPr>
+          <w:b w:val="false"/>
+          <w:bCs w:val="false"/>
+          <w:i w:val="false"/>
+          <w:iCs w:val="false"/>
+          <w:sz w:val="24"/>
+          <w:szCs w:val="24"/>
+        </w:rPr>
+        <w:t xml:space="preserve">BOOCH, Grady; RUMBAUGH, James; JACOBSON, Ivar. </w:t>
+      </w:r>
+      <w:r>
+        <w:rPr>
+          <w:b w:val="false"/>
+          <w:bCs w:val="false"/>
+          <w:i/>
+          <w:iCs/>
+          <w:sz w:val="24"/>
+          <w:szCs w:val="24"/>
+        </w:rPr>
+        <w:t xml:space="preserve">UML: guia do usuário</w:t>
+      </w:r>
+      <w:r>
+        <w:rPr>
+          <w:b w:val="false"/>
+          <w:bCs w:val="false"/>
+          <w:i w:val="false"/>
+          <w:iCs w:val="false"/>
+          <w:sz w:val="24"/>
+          <w:szCs w:val="24"/>
+        </w:rPr>
+        <w:t xml:space="preserve">. 2. ed. Rio de Janeiro: Elsevier, 2006.</w:t>
+      </w:r>
+    </w:p>
+    <w:p>
+      <w:pPr>
+        <w:spacing w:after="240" w:line="240"/>
+        <w:jc w:val="left"/>
+      </w:pPr>
+      <w:r>
+        <w:rPr>
+          <w:b w:val="false"/>
+          <w:bCs w:val="false"/>
+          <w:i w:val="false"/>
+          <w:iCs w:val="false"/>
+          <w:sz w:val="24"/>
+          <w:szCs w:val="24"/>
+        </w:rPr>
+        <w:t xml:space="preserve">FOWLER, Martin. </w:t>
+      </w:r>
+      <w:r>
+        <w:rPr>
+          <w:b w:val="false"/>
+          <w:bCs w:val="false"/>
+          <w:i/>
+          <w:iCs/>
+          <w:sz w:val="24"/>
+          <w:szCs w:val="24"/>
+        </w:rPr>
+        <w:t xml:space="preserve">UML essencial: um breve guia para a linguagem-padrão de modelagem de objetos</w:t>
+      </w:r>
+      <w:r>
+        <w:rPr>
+          <w:b w:val="false"/>
+          <w:bCs w:val="false"/>
+          <w:i w:val="false"/>
+          <w:iCs w:val="false"/>
+          <w:sz w:val="24"/>
+          <w:szCs w:val="24"/>
+        </w:rPr>
+        <w:t xml:space="preserve">. 3. ed. Porto Alegre: Bookman, 2005.</w:t>
+      </w:r>
+    </w:p>
+    <w:p>
+      <w:pPr>
+        <w:spacing w:after="240" w:line="240"/>
+        <w:jc w:val="left"/>
+      </w:pPr>
+      <w:r>
+        <w:rPr>
+          <w:b w:val="false"/>
+          <w:bCs w:val="false"/>
+          <w:i w:val="false"/>
+          <w:iCs w:val="false"/>
+          <w:sz w:val="24"/>
+          <w:szCs w:val="24"/>
+        </w:rPr>
+        <w:t xml:space="preserve">GUEDES, Gilleanes T. A. </w:t>
+      </w:r>
+      <w:r>
+        <w:rPr>
+          <w:b w:val="false"/>
+          <w:bCs w:val="false"/>
+          <w:i/>
+          <w:iCs/>
+          <w:sz w:val="24"/>
+          <w:szCs w:val="24"/>
+        </w:rPr>
+        <w:t xml:space="preserve">UML 2: uma abordagem prática</w:t>
+      </w:r>
+      <w:r>
+        <w:rPr>
+          <w:b w:val="false"/>
+          <w:bCs w:val="false"/>
+          <w:i w:val="false"/>
+          <w:iCs w:val="false"/>
+          <w:sz w:val="24"/>
+          <w:szCs w:val="24"/>
+        </w:rPr>
+        <w:t xml:space="preserve">. 3. ed. São Paulo: Novatec, 2018.</w:t>
+      </w:r>
+    </w:p>
+    <w:p>
+      <w:pPr>
+        <w:spacing w:after="240" w:line="240"/>
+        <w:jc w:val="left"/>
+      </w:pPr>
+      <w:r>
+        <w:rPr>
+          <w:b w:val="false"/>
+          <w:bCs w:val="false"/>
+          <w:i w:val="false"/>
+          <w:iCs w:val="false"/>
+          <w:sz w:val="24"/>
+          <w:szCs w:val="24"/>
+        </w:rPr>
+        <w:t xml:space="preserve">OBJECT MANAGEMENT GROUP. </w:t>
+      </w:r>
+      <w:r>
+        <w:rPr>
+          <w:b w:val="false"/>
+          <w:bCs w:val="false"/>
+          <w:i/>
+          <w:iCs/>
+          <w:sz w:val="24"/>
+          <w:szCs w:val="24"/>
+        </w:rPr>
+        <w:t xml:space="preserve">OMG Unified Modeling Language (OMG UML): version 2.5.1</w:t>
+      </w:r>
+      <w:r>
+        <w:rPr>
+          <w:b w:val="false"/>
+          <w:bCs w:val="false"/>
+          <w:i w:val="false"/>
+          <w:iCs w:val="false"/>
+          <w:sz w:val="24"/>
+          <w:szCs w:val="24"/>
+        </w:rPr>
+        <w:t xml:space="preserve">. Needham: OMG, 2017. Disponível em: https://www.omg.org/spec/UML/2.5.1. Acesso em: 25 ago. 2026.</w:t>
+      </w:r>
+    </w:p>
+    <w:p>
+      <w:pPr>
+        <w:spacing w:after="240" w:line="240"/>
+        <w:jc w:val="left"/>
+      </w:pPr>
+      <w:r>
+        <w:rPr>
+          <w:b w:val="false"/>
+          <w:bCs w:val="false"/>
+          <w:i w:val="false"/>
+          <w:iCs w:val="false"/>
+          <w:sz w:val="24"/>
+          <w:szCs w:val="24"/>
+        </w:rPr>
+        <w:t xml:space="preserve">PRESSMAN, Roger S.; MAXIM, Bruce R. </w:t>
+      </w:r>
+      <w:r>
+        <w:rPr>
+          <w:b w:val="false"/>
+          <w:bCs w:val="false"/>
+          <w:i/>
+          <w:iCs/>
+          <w:sz w:val="24"/>
+          <w:szCs w:val="24"/>
+        </w:rPr>
+        <w:t xml:space="preserve">Engenharia de software: uma abordagem profissional</w:t>
+      </w:r>
+      <w:r>
+        <w:rPr>
+          <w:b w:val="false"/>
+          <w:bCs w:val="false"/>
+          <w:i w:val="false"/>
+          <w:iCs w:val="false"/>
+          <w:sz w:val="24"/>
+          <w:szCs w:val="24"/>
+        </w:rPr>
+        <w:t xml:space="preserve">. 8. ed. Porto Alegre: AMGH, 2016.</w:t>
+      </w:r>
+    </w:p>
+    <w:p>
+      <w:pPr>
+        <w:spacing w:after="240" w:line="240"/>
+        <w:jc w:val="left"/>
+      </w:pPr>
+      <w:r>
+        <w:rPr>
+          <w:b w:val="false"/>
+          <w:bCs w:val="false"/>
+          <w:i w:val="false"/>
+          <w:iCs w:val="false"/>
+          <w:sz w:val="24"/>
+          <w:szCs w:val="24"/>
+        </w:rPr>
+        <w:t xml:space="preserve">SOMMERVILLE, Ian. </w:t>
+      </w:r>
+      <w:r>
+        <w:rPr>
+          <w:b w:val="false"/>
+          <w:bCs w:val="false"/>
+          <w:i/>
+          <w:iCs/>
+          <w:sz w:val="24"/>
+          <w:szCs w:val="24"/>
+        </w:rPr>
+        <w:t xml:space="preserve">Engenharia de software</w:t>
+      </w:r>
+      <w:r>
+        <w:rPr>
+          <w:b w:val="false"/>
+          <w:bCs w:val="false"/>
+          <w:i w:val="false"/>
+          <w:iCs w:val="false"/>
+          <w:sz w:val="24"/>
+          <w:szCs w:val="24"/>
+        </w:rPr>
+        <w:t xml:space="preserve">. 10. ed. São Paulo: Pearson, 2019.</w:t>
       </w:r>
     </w:p>
     <w:sectPr>
-      <w:footerReference w:type="default" r:id="rId9"/>
+      <w:headerReference w:type="default" r:id="rId9"/>
       <w:pgSz w:w="11906" w:h="16838" w:orient="portrait"/>
       <w:pgMar w:top="1700" w:right="1133" w:bottom="1133" w:left="1700" w:header="708" w:footer="708" w:gutter="0"/>
       <w:pgNumType/>
@@ -15920,10 +16431,48 @@
 </w:endnotes>
 </file>
 
-<file path=word/footer1.xml><?xml version="1.0" encoding="utf-8"?>
-<w:ftr xmlns:wpc="http://schemas.microsoft.com/office/word/2010/wordprocessingCanvas" xmlns:mc="http://schemas.openxmlformats.org/markup-compatibility/2006" xmlns:o="urn:schemas-microsoft-com:office:office" xmlns:r="http://schemas.openxmlformats.org/officeDocument/2006/relationships" xmlns:m="http://schemas.openxmlformats.org/officeDocument/2006/math" xmlns:v="urn:schemas-microsoft-com:vml" xmlns:wp14="http://schemas.microsoft.com/office/word/2010/wordprocessingDrawing" xmlns:wp="http://schemas.openxmlformats.org/drawingml/2006/wordprocessingDrawing" xmlns:w10="urn:schemas-microsoft-com:office:word" xmlns:w="http://schemas.openxmlformats.org/wordprocessingml/2006/main" xmlns:w14="http://schemas.microsoft.com/office/word/2010/wordml" xmlns:w15="http://schemas.microsoft.com/office/word/2012/wordml" xmlns:wpg="http://schemas.microsoft.com/office/word/2010/wordprocessingGroup" xmlns:wpi="http://schemas.microsoft.com/office/word/2010/wordprocessingInk" xmlns:wne="http://schemas.microsoft.com/office/word/2006/wordml" xmlns:wps="http://schemas.microsoft.com/office/word/2010/wordprocessingShape">
+<file path=word/footnotes.xml><?xml version="1.0" encoding="utf-8"?>
+<w:footnotes xmlns:wpc="http://schemas.microsoft.com/office/word/2010/wordprocessingCanvas" xmlns:mc="http://schemas.openxmlformats.org/markup-compatibility/2006" xmlns:o="urn:schemas-microsoft-com:office:office" xmlns:r="http://schemas.openxmlformats.org/officeDocument/2006/relationships" xmlns:m="http://schemas.openxmlformats.org/officeDocument/2006/math" xmlns:v="urn:schemas-microsoft-com:vml" xmlns:wp14="http://schemas.microsoft.com/office/word/2010/wordprocessingDrawing" xmlns:wp="http://schemas.openxmlformats.org/drawingml/2006/wordprocessingDrawing" xmlns:w10="urn:schemas-microsoft-com:office:word" xmlns:w="http://schemas.openxmlformats.org/wordprocessingml/2006/main" xmlns:w14="http://schemas.microsoft.com/office/word/2010/wordml" xmlns:w15="http://schemas.microsoft.com/office/word/2012/wordml" xmlns:wpg="http://schemas.microsoft.com/office/word/2010/wordprocessingGroup" xmlns:wpi="http://schemas.microsoft.com/office/word/2010/wordprocessingInk" xmlns:wne="http://schemas.microsoft.com/office/word/2006/wordml" xmlns:wps="http://schemas.microsoft.com/office/word/2010/wordprocessingShape" mc:Ignorable="w14 w15 wp14">
+  <w:footnote w:type="separator" w:id="-1">
+    <w:p>
+      <w:pPr>
+        <w:spacing w:after="0" w:line="240" w:lineRule="auto"/>
+      </w:pPr>
+      <w:r>
+        <w:rPr>
+          <w:rStyle w:val="FootnoteReference"/>
+        </w:rPr>
+        <w:footnoteRef/>
+      </w:r>
+      <w:r>
+        <w:separator/>
+      </w:r>
+    </w:p>
+  </w:footnote>
+  <w:footnote w:type="continuationSeparator" w:id="0">
+    <w:p>
+      <w:pPr>
+        <w:spacing w:after="0" w:line="240" w:lineRule="auto"/>
+      </w:pPr>
+      <w:r>
+        <w:rPr>
+          <w:rStyle w:val="FootnoteReference"/>
+        </w:rPr>
+        <w:footnoteRef/>
+      </w:r>
+      <w:r>
+        <w:continuationSeparator/>
+      </w:r>
+    </w:p>
+  </w:footnote>
+</w:footnotes>
+</file>
+
+<file path=word/header1.xml><?xml version="1.0" encoding="utf-8"?>
+<w:hdr xmlns:wpc="http://schemas.microsoft.com/office/word/2010/wordprocessingCanvas" xmlns:mc="http://schemas.openxmlformats.org/markup-compatibility/2006" xmlns:o="urn:schemas-microsoft-com:office:office" xmlns:r="http://schemas.openxmlformats.org/officeDocument/2006/relationships" xmlns:m="http://schemas.openxmlformats.org/officeDocument/2006/math" xmlns:v="urn:schemas-microsoft-com:vml" xmlns:wp14="http://schemas.microsoft.com/office/word/2010/wordprocessingDrawing" xmlns:wp="http://schemas.openxmlformats.org/drawingml/2006/wordprocessingDrawing" xmlns:w10="urn:schemas-microsoft-com:office:word" xmlns:w="http://schemas.openxmlformats.org/wordprocessingml/2006/main" xmlns:w14="http://schemas.microsoft.com/office/word/2010/wordml" xmlns:w15="http://schemas.microsoft.com/office/word/2012/wordml" xmlns:wpg="http://schemas.microsoft.com/office/word/2010/wordprocessingGroup" xmlns:wpi="http://schemas.microsoft.com/office/word/2010/wordprocessingInk" xmlns:wne="http://schemas.microsoft.com/office/word/2006/wordml" xmlns:wps="http://schemas.microsoft.com/office/word/2010/wordprocessingShape" xmlns:cx="http://schemas.microsoft.com/office/drawing/2014/chartex" xmlns:cx1="http://schemas.microsoft.com/office/drawing/2015/9/8/chartex" xmlns:cx2="http://schemas.microsoft.com/office/drawing/2015/10/21/chartex" xmlns:cx3="http://schemas.microsoft.com/office/drawing/2016/5/9/chartex" xmlns:cx4="http://schemas.microsoft.com/office/drawing/2016/5/10/chartex" xmlns:cx5="http://schemas.microsoft.com/office/drawing/2016/5/11/chartex" xmlns:cx6="http://schemas.microsoft.com/office/drawing/2016/5/12/chartex" xmlns:cx7="http://schemas.microsoft.com/office/drawing/2016/5/13/chartex" xmlns:cx8="http://schemas.microsoft.com/office/drawing/2016/5/14/chartex" xmlns:w16cid="http://schemas.microsoft.com/office/word/2016/wordml/cid" xmlns:w16se="http://schemas.microsoft.com/office/word/2015/wordml/symex">
   <w:p>
     <w:pPr>
+      <w:spacing w:after="0" w:line="240"/>
       <w:jc w:val="right"/>
     </w:pPr>
     <w:r>
@@ -15937,13 +16486,14 @@
       <w:fldChar w:fldCharType="end"/>
     </w:r>
   </w:p>
-</w:ftr>
+</w:hdr>
 </file>
 
-<file path=word/footer2.xml><?xml version="1.0" encoding="utf-8"?>
-<w:ftr xmlns:wpc="http://schemas.microsoft.com/office/word/2010/wordprocessingCanvas" xmlns:mc="http://schemas.openxmlformats.org/markup-compatibility/2006" xmlns:o="urn:schemas-microsoft-com:office:office" xmlns:r="http://schemas.openxmlformats.org/officeDocument/2006/relationships" xmlns:m="http://schemas.openxmlformats.org/officeDocument/2006/math" xmlns:v="urn:schemas-microsoft-com:vml" xmlns:wp14="http://schemas.microsoft.com/office/word/2010/wordprocessingDrawing" xmlns:wp="http://schemas.openxmlformats.org/drawingml/2006/wordprocessingDrawing" xmlns:w10="urn:schemas-microsoft-com:office:word" xmlns:w="http://schemas.openxmlformats.org/wordprocessingml/2006/main" xmlns:w14="http://schemas.microsoft.com/office/word/2010/wordml" xmlns:w15="http://schemas.microsoft.com/office/word/2012/wordml" xmlns:wpg="http://schemas.microsoft.com/office/word/2010/wordprocessingGroup" xmlns:wpi="http://schemas.microsoft.com/office/word/2010/wordprocessingInk" xmlns:wne="http://schemas.microsoft.com/office/word/2006/wordml" xmlns:wps="http://schemas.microsoft.com/office/word/2010/wordprocessingShape">
+<file path=word/header2.xml><?xml version="1.0" encoding="utf-8"?>
+<w:hdr xmlns:wpc="http://schemas.microsoft.com/office/word/2010/wordprocessingCanvas" xmlns:mc="http://schemas.openxmlformats.org/markup-compatibility/2006" xmlns:o="urn:schemas-microsoft-com:office:office" xmlns:r="http://schemas.openxmlformats.org/officeDocument/2006/relationships" xmlns:m="http://schemas.openxmlformats.org/officeDocument/2006/math" xmlns:v="urn:schemas-microsoft-com:vml" xmlns:wp14="http://schemas.microsoft.com/office/word/2010/wordprocessingDrawing" xmlns:wp="http://schemas.openxmlformats.org/drawingml/2006/wordprocessingDrawing" xmlns:w10="urn:schemas-microsoft-com:office:word" xmlns:w="http://schemas.openxmlformats.org/wordprocessingml/2006/main" xmlns:w14="http://schemas.microsoft.com/office/word/2010/wordml" xmlns:w15="http://schemas.microsoft.com/office/word/2012/wordml" xmlns:wpg="http://schemas.microsoft.com/office/word/2010/wordprocessingGroup" xmlns:wpi="http://schemas.microsoft.com/office/word/2010/wordprocessingInk" xmlns:wne="http://schemas.microsoft.com/office/word/2006/wordml" xmlns:wps="http://schemas.microsoft.com/office/word/2010/wordprocessingShape" xmlns:cx="http://schemas.microsoft.com/office/drawing/2014/chartex" xmlns:cx1="http://schemas.microsoft.com/office/drawing/2015/9/8/chartex" xmlns:cx2="http://schemas.microsoft.com/office/drawing/2015/10/21/chartex" xmlns:cx3="http://schemas.microsoft.com/office/drawing/2016/5/9/chartex" xmlns:cx4="http://schemas.microsoft.com/office/drawing/2016/5/10/chartex" xmlns:cx5="http://schemas.microsoft.com/office/drawing/2016/5/11/chartex" xmlns:cx6="http://schemas.microsoft.com/office/drawing/2016/5/12/chartex" xmlns:cx7="http://schemas.microsoft.com/office/drawing/2016/5/13/chartex" xmlns:cx8="http://schemas.microsoft.com/office/drawing/2016/5/14/chartex" xmlns:w16cid="http://schemas.microsoft.com/office/word/2016/wordml/cid" xmlns:w16se="http://schemas.microsoft.com/office/word/2015/wordml/symex">
   <w:p>
     <w:pPr>
+      <w:spacing w:after="0" w:line="240"/>
       <w:jc w:val="right"/>
     </w:pPr>
     <w:r>
@@ -15957,13 +16507,14 @@
       <w:fldChar w:fldCharType="end"/>
     </w:r>
   </w:p>
-</w:ftr>
+</w:hdr>
 </file>
 
-<file path=word/footer3.xml><?xml version="1.0" encoding="utf-8"?>
-<w:ftr xmlns:wpc="http://schemas.microsoft.com/office/word/2010/wordprocessingCanvas" xmlns:mc="http://schemas.openxmlformats.org/markup-compatibility/2006" xmlns:o="urn:schemas-microsoft-com:office:office" xmlns:r="http://schemas.openxmlformats.org/officeDocument/2006/relationships" xmlns:m="http://schemas.openxmlformats.org/officeDocument/2006/math" xmlns:v="urn:schemas-microsoft-com:vml" xmlns:wp14="http://schemas.microsoft.com/office/word/2010/wordprocessingDrawing" xmlns:wp="http://schemas.openxmlformats.org/drawingml/2006/wordprocessingDrawing" xmlns:w10="urn:schemas-microsoft-com:office:word" xmlns:w="http://schemas.openxmlformats.org/wordprocessingml/2006/main" xmlns:w14="http://schemas.microsoft.com/office/word/2010/wordml" xmlns:w15="http://schemas.microsoft.com/office/word/2012/wordml" xmlns:wpg="http://schemas.microsoft.com/office/word/2010/wordprocessingGroup" xmlns:wpi="http://schemas.microsoft.com/office/word/2010/wordprocessingInk" xmlns:wne="http://schemas.microsoft.com/office/word/2006/wordml" xmlns:wps="http://schemas.microsoft.com/office/word/2010/wordprocessingShape">
+<file path=word/header3.xml><?xml version="1.0" encoding="utf-8"?>
+<w:hdr xmlns:wpc="http://schemas.microsoft.com/office/word/2010/wordprocessingCanvas" xmlns:mc="http://schemas.openxmlformats.org/markup-compatibility/2006" xmlns:o="urn:schemas-microsoft-com:office:office" xmlns:r="http://schemas.openxmlformats.org/officeDocument/2006/relationships" xmlns:m="http://schemas.openxmlformats.org/officeDocument/2006/math" xmlns:v="urn:schemas-microsoft-com:vml" xmlns:wp14="http://schemas.microsoft.com/office/word/2010/wordprocessingDrawing" xmlns:wp="http://schemas.openxmlformats.org/drawingml/2006/wordprocessingDrawing" xmlns:w10="urn:schemas-microsoft-com:office:word" xmlns:w="http://schemas.openxmlformats.org/wordprocessingml/2006/main" xmlns:w14="http://schemas.microsoft.com/office/word/2010/wordml" xmlns:w15="http://schemas.microsoft.com/office/word/2012/wordml" xmlns:wpg="http://schemas.microsoft.com/office/word/2010/wordprocessingGroup" xmlns:wpi="http://schemas.microsoft.com/office/word/2010/wordprocessingInk" xmlns:wne="http://schemas.microsoft.com/office/word/2006/wordml" xmlns:wps="http://schemas.microsoft.com/office/word/2010/wordprocessingShape" xmlns:cx="http://schemas.microsoft.com/office/drawing/2014/chartex" xmlns:cx1="http://schemas.microsoft.com/office/drawing/2015/9/8/chartex" xmlns:cx2="http://schemas.microsoft.com/office/drawing/2015/10/21/chartex" xmlns:cx3="http://schemas.microsoft.com/office/drawing/2016/5/9/chartex" xmlns:cx4="http://schemas.microsoft.com/office/drawing/2016/5/10/chartex" xmlns:cx5="http://schemas.microsoft.com/office/drawing/2016/5/11/chartex" xmlns:cx6="http://schemas.microsoft.com/office/drawing/2016/5/12/chartex" xmlns:cx7="http://schemas.microsoft.com/office/drawing/2016/5/13/chartex" xmlns:cx8="http://schemas.microsoft.com/office/drawing/2016/5/14/chartex" xmlns:w16cid="http://schemas.microsoft.com/office/word/2016/wordml/cid" xmlns:w16se="http://schemas.microsoft.com/office/word/2015/wordml/symex">
   <w:p>
     <w:pPr>
+      <w:spacing w:after="0" w:line="240"/>
       <w:jc w:val="right"/>
     </w:pPr>
     <w:r>
@@ -15977,44 +16528,7 @@
       <w:fldChar w:fldCharType="end"/>
     </w:r>
   </w:p>
-</w:ftr>
-</file>
-
-<file path=word/footnotes.xml><?xml version="1.0" encoding="utf-8"?>
-<w:footnotes xmlns:wpc="http://schemas.microsoft.com/office/word/2010/wordprocessingCanvas" xmlns:mc="http://schemas.openxmlformats.org/markup-compatibility/2006" xmlns:o="urn:schemas-microsoft-com:office:office" xmlns:r="http://schemas.openxmlformats.org/officeDocument/2006/relationships" xmlns:m="http://schemas.openxmlformats.org/officeDocument/2006/math" xmlns:v="urn:schemas-microsoft-com:vml" xmlns:wp14="http://schemas.microsoft.com/office/word/2010/wordprocessingDrawing" xmlns:wp="http://schemas.openxmlformats.org/drawingml/2006/wordprocessingDrawing" xmlns:w10="urn:schemas-microsoft-com:office:word" xmlns:w="http://schemas.openxmlformats.org/wordprocessingml/2006/main" xmlns:w14="http://schemas.microsoft.com/office/word/2010/wordml" xmlns:w15="http://schemas.microsoft.com/office/word/2012/wordml" xmlns:wpg="http://schemas.microsoft.com/office/word/2010/wordprocessingGroup" xmlns:wpi="http://schemas.microsoft.com/office/word/2010/wordprocessingInk" xmlns:wne="http://schemas.microsoft.com/office/word/2006/wordml" xmlns:wps="http://schemas.microsoft.com/office/word/2010/wordprocessingShape" mc:Ignorable="w14 w15 wp14">
-  <w:footnote w:type="separator" w:id="-1">
-    <w:p>
-      <w:pPr>
-        <w:spacing w:after="0" w:line="240" w:lineRule="auto"/>
-      </w:pPr>
-      <w:r>
-        <w:rPr>
-          <w:rStyle w:val="FootnoteReference"/>
-        </w:rPr>
-        <w:footnoteRef/>
-      </w:r>
-      <w:r>
-        <w:separator/>
-      </w:r>
-    </w:p>
-  </w:footnote>
-  <w:footnote w:type="continuationSeparator" w:id="0">
-    <w:p>
-      <w:pPr>
-        <w:spacing w:after="0" w:line="240" w:lineRule="auto"/>
-      </w:pPr>
-      <w:r>
-        <w:rPr>
-          <w:rStyle w:val="FootnoteReference"/>
-        </w:rPr>
-        <w:footnoteRef/>
-      </w:r>
-      <w:r>
-        <w:continuationSeparator/>
-      </w:r>
-    </w:p>
-  </w:footnote>
-</w:footnotes>
+</w:hdr>
 </file>
 
 <file path=word/numbering.xml><?xml version="1.0" encoding="utf-8"?>
@@ -16149,8 +16663,8 @@
       <w:b/>
       <w:bCs/>
       <w:color w:val="000000"/>
-      <w:sz w:val="26"/>
-      <w:szCs w:val="26"/>
+      <w:sz w:val="24"/>
+      <w:szCs w:val="24"/>
     </w:rPr>
   </w:style>
   <w:style w:type="paragraph" w:styleId="Heading2">

</xml_diff>